<commit_message>
Finalize reviewed NIST CSF localized editions
</commit_message>
<xml_diff>
--- a/01-foundations/NIST_CSF_2/Espanol/NIST_CSF_2_Practical_GRC_and_Junior_Analyst_Manual_Espanol_v1.0.docx
+++ b/01-foundations/NIST_CSF_2/Espanol/NIST_CSF_2_Practical_GRC_and_Junior_Analyst_Manual_Espanol_v1.0.docx
@@ -4703,24 +4703,6 @@
         </w:tc>
       </w:tr>
     </w:tbl>
-    <w:p>
-      <w:pPr>
-        <w:pStyle w:val="BlockText"/>
-      </w:pPr>
-      <w:r>
-        <w:rPr>
-          <w:bCs/>
-          <w:b/>
-        </w:rPr>
-        <w:t xml:space="preserve">Estado:</w:t>
-      </w:r>
-      <w:r>
-        <w:t xml:space="preserve"> </w:t>
-      </w:r>
-      <w:r>
-        <w:t xml:space="preserve">Traducción humana revisada para integración. Conserva los identificadores oficiales del NIST CSF 2.0. Este archivo sustituye únicamente el contenido textual de los capítulos 6–9; la edición completa todavía requiere integración, regeneración de DOCX/PDF y revisión visual.</w:t>
-      </w:r>
-    </w:p>
     <w:bookmarkEnd w:id="42"/>
     <w:bookmarkEnd w:id="43"/>
     <w:bookmarkStart w:id="49" w:name="función-proteger"/>
@@ -8931,7 +8913,7 @@
     <w:bookmarkStart w:id="61" w:name="declaración-del-alcance-del-perfil"/>
     <w:p>
       <w:pPr>
-        <w:pStyle w:val="Heading3"/>
+        <w:pStyle w:val="Heading2"/>
       </w:pPr>
       <w:r>
         <w:t xml:space="preserve">10.1 Declaración del alcance del Perfil</w:t>
@@ -9013,7 +8995,7 @@
     <w:bookmarkStart w:id="62" w:name="estado-de-los-resultados"/>
     <w:p>
       <w:pPr>
-        <w:pStyle w:val="Heading3"/>
+        <w:pStyle w:val="Heading2"/>
       </w:pPr>
       <w:r>
         <w:t xml:space="preserve">10.2 Estado de los resultados</w:t>
@@ -9279,7 +9261,7 @@
     <w:bookmarkStart w:id="63" w:name="priorización-de-brechas"/>
     <w:p>
       <w:pPr>
-        <w:pStyle w:val="Heading3"/>
+        <w:pStyle w:val="Heading2"/>
       </w:pPr>
       <w:r>
         <w:t xml:space="preserve">10.3 Priorización de brechas</w:t>

</xml_diff>

<commit_message>
Integrate localized NIST CSF graphics and rebuild editions
</commit_message>
<xml_diff>
--- a/01-foundations/NIST_CSF_2/Espanol/NIST_CSF_2_Practical_GRC_and_Junior_Analyst_Manual_Espanol_v1.0.docx
+++ b/01-foundations/NIST_CSF_2/Espanol/NIST_CSF_2_Practical_GRC_and_Junior_Analyst_Manual_Espanol_v1.0.docx
@@ -2011,7 +2011,7 @@
       </w:hyperlink>
     </w:p>
     <w:bookmarkEnd w:id="24"/>
-    <w:bookmarkStart w:id="28" w:name="nist-csf-2.0-foundations"/>
+    <w:bookmarkStart w:id="31" w:name="nist-csf-2.0-foundations"/>
     <w:p>
       <w:pPr>
         <w:pStyle w:val="Heading1"/>
@@ -2034,56 +2034,58 @@
     </w:p>
     <w:p>
       <w:pPr>
-        <w:pStyle w:val="BodyText"/>
-      </w:pPr>
-      <w:r>
-        <w:t xml:space="preserve">■img src=</w:t>
-      </w:r>
-      <w:r>
-        <w:t xml:space="preserve">“</w:t>
-      </w:r>
-      <w:r>
-        <w:t xml:space="preserve">media/image1_es-419.png</w:t>
-      </w:r>
-      <w:r>
-        <w:t xml:space="preserve">”</w:t>
-      </w:r>
-      <w:r>
-        <w:t xml:space="preserve"> </w:t>
-      </w:r>
-      <w:r>
-        <w:t xml:space="preserve">estilo=</w:t>
-      </w:r>
-      <w:r>
-        <w:t xml:space="preserve">“</w:t>
-      </w:r>
-      <w:r>
-        <w:t xml:space="preserve">Ancho:6.15in; Altura:3.39605in</w:t>
-      </w:r>
-      <w:r>
-        <w:t xml:space="preserve">”</w:t>
-      </w:r>
-      <w:r>
-        <w:t xml:space="preserve"> </w:t>
-      </w:r>
-      <w:r>
-        <w:t xml:space="preserve">alt=</w:t>
-      </w:r>
-      <w:r>
-        <w:t xml:space="preserve">“</w:t>
-      </w:r>
+        <w:pStyle w:val="CaptionedFigure"/>
+      </w:pPr>
+      <w:r>
+        <w:drawing>
+          <wp:inline>
+            <wp:extent cx="5334000" cy="2963333"/>
+            <wp:effectExtent b="0" l="0" r="0" t="0"/>
+            <wp:docPr descr="Govern, Identificar, Proteger, Detectar, Responder y Recuperar el trabajo como un sistema conectado." title="" id="26" name="Picture"/>
+            <a:graphic>
+              <a:graphicData uri="http://schemas.openxmlformats.org/drawingml/2006/picture">
+                <pic:pic>
+                  <pic:nvPicPr>
+                    <pic:cNvPr descr="media/image1_es-419.png" id="27" name="Picture"/>
+                    <pic:cNvPicPr>
+                      <a:picLocks noChangeArrowheads="1" noChangeAspect="1"/>
+                    </pic:cNvPicPr>
+                  </pic:nvPicPr>
+                  <pic:blipFill>
+                    <a:blip r:embed="rId25"/>
+                    <a:stretch>
+                      <a:fillRect/>
+                    </a:stretch>
+                  </pic:blipFill>
+                  <pic:spPr bwMode="auto">
+                    <a:xfrm>
+                      <a:off x="0" y="0"/>
+                      <a:ext cx="5334000" cy="2963333"/>
+                    </a:xfrm>
+                    <a:prstGeom prst="rect">
+                      <a:avLst/>
+                    </a:prstGeom>
+                    <a:noFill/>
+                    <a:ln w="9525">
+                      <a:noFill/>
+                      <a:headEnd/>
+                      <a:tailEnd/>
+                    </a:ln>
+                  </pic:spPr>
+                </pic:pic>
+              </a:graphicData>
+            </a:graphic>
+          </wp:inline>
+        </w:drawing>
+      </w:r>
+    </w:p>
+    <w:p>
+      <w:pPr>
+        <w:pStyle w:val="ImageCaption"/>
+      </w:pPr>
       <w:r>
         <w:t xml:space="preserve">Govern, Identificar, Proteger, Detectar, Responder y Recuperar el trabajo como un sistema conectado.</w:t>
       </w:r>
-      <w:r>
-        <w:t xml:space="preserve">”</w:t>
-      </w:r>
-      <w:r>
-        <w:t xml:space="preserve"> </w:t>
-      </w:r>
-      <w:r>
-        <w:t xml:space="preserve">/</w:t>
-      </w:r>
     </w:p>
     <w:p>
       <w:pPr>
@@ -2093,7 +2095,7 @@
         <w:t xml:space="preserve">Figura 1. Las seis funciones NIST CSF 2.0</w:t>
       </w:r>
     </w:p>
-    <w:bookmarkStart w:id="25" w:name="what-csf-2.0-is"/>
+    <w:bookmarkStart w:id="28" w:name="what-csf-2.0-is"/>
     <w:p>
       <w:pPr>
         <w:pStyle w:val="Heading2"/>
@@ -2110,8 +2112,8 @@
         <w:t xml:space="preserve">NIST publicó CSF 2.0 el 26 de febrero de 2024. Está diseñado para organizaciones de todo tamaño, sector y nivel de sofisticación técnica. Sus resultados son nacionales, sectoriales y tecnológicamente neutros. Las organizaciones pueden adoptarlo voluntariamente o porque una política, contrato, regulador, cliente o estándar interno lo solicite.</w:t>
       </w:r>
     </w:p>
-    <w:bookmarkEnd w:id="25"/>
-    <w:bookmarkStart w:id="26" w:name="qué-cambió-desde-csf-1.1"/>
+    <w:bookmarkEnd w:id="28"/>
+    <w:bookmarkStart w:id="29" w:name="qué-cambió-desde-csf-1.1"/>
     <w:p>
       <w:pPr>
         <w:pStyle w:val="Heading2"/>
@@ -2175,8 +2177,8 @@
         <w:t xml:space="preserve">Algunos números de Subcategoría contienen lagunas intencionales porque el contenido CSF 1.1 se movió dentro de CSF 2.0.</w:t>
       </w:r>
     </w:p>
-    <w:bookmarkEnd w:id="26"/>
-    <w:bookmarkStart w:id="27" w:name="what-csf-2.0-is-not"/>
+    <w:bookmarkEnd w:id="29"/>
+    <w:bookmarkStart w:id="30" w:name="what-csf-2.0-is-not"/>
     <w:p>
       <w:pPr>
         <w:pStyle w:val="Heading2"/>
@@ -2251,9 +2253,9 @@
         <w:t xml:space="preserve">Una asignación a un resultado CSF no prueba que el resultado se alcance.</w:t>
       </w:r>
     </w:p>
-    <w:bookmarkEnd w:id="27"/>
-    <w:bookmarkEnd w:id="28"/>
-    <w:bookmarkStart w:id="51" w:name="Xb1e465cb7f877a0783bcef82b82ec4363298ef5"/>
+    <w:bookmarkEnd w:id="30"/>
+    <w:bookmarkEnd w:id="31"/>
+    <w:bookmarkStart w:id="57" w:name="Xb1e465cb7f877a0783bcef82b82ec4363298ef5"/>
     <w:p>
       <w:pPr>
         <w:pStyle w:val="Heading1"/>
@@ -2276,55 +2278,57 @@
     </w:p>
     <w:p>
       <w:pPr>
-        <w:pStyle w:val="BodyText"/>
-      </w:pPr>
-      <w:r>
-        <w:t xml:space="preserve">■img src=</w:t>
-      </w:r>
-      <w:r>
-        <w:t xml:space="preserve">“</w:t>
-      </w:r>
-      <w:r>
-        <w:t xml:space="preserve">media/image2_es-419.png</w:t>
-      </w:r>
-      <w:r>
-        <w:t xml:space="preserve">”</w:t>
-      </w:r>
-      <w:r>
-        <w:t xml:space="preserve"> </w:t>
-      </w:r>
-      <w:r>
-        <w:t xml:space="preserve">style=</w:t>
-      </w:r>
-      <w:r>
-        <w:t xml:space="preserve">“</w:t>
-      </w:r>
-      <w:r>
-        <w:t xml:space="preserve">width:6.15in;height:2.6593in</w:t>
-      </w:r>
-      <w:r>
-        <w:t xml:space="preserve">”</w:t>
-      </w:r>
-      <w:r>
-        <w:t xml:space="preserve"> </w:t>
-      </w:r>
-      <w:r>
-        <w:t xml:space="preserve">alt=</w:t>
-      </w:r>
-      <w:r>
-        <w:t xml:space="preserve">“</w:t>
-      </w:r>
+        <w:pStyle w:val="CaptionedFigure"/>
+      </w:pPr>
+      <w:r>
+        <w:drawing>
+          <wp:inline>
+            <wp:extent cx="5334000" cy="2963333"/>
+            <wp:effectExtent b="0" l="0" r="0" t="0"/>
+            <wp:docPr descr="Las fusiones contienen Categorías, que contienen Subcategorías específicas centradas en el resultado." title="" id="33" name="Picture"/>
+            <a:graphic>
+              <a:graphicData uri="http://schemas.openxmlformats.org/drawingml/2006/picture">
+                <pic:pic>
+                  <pic:nvPicPr>
+                    <pic:cNvPr descr="media/image2_es-419.png" id="34" name="Picture"/>
+                    <pic:cNvPicPr>
+                      <a:picLocks noChangeArrowheads="1" noChangeAspect="1"/>
+                    </pic:cNvPicPr>
+                  </pic:nvPicPr>
+                  <pic:blipFill>
+                    <a:blip r:embed="rId32"/>
+                    <a:stretch>
+                      <a:fillRect/>
+                    </a:stretch>
+                  </pic:blipFill>
+                  <pic:spPr bwMode="auto">
+                    <a:xfrm>
+                      <a:off x="0" y="0"/>
+                      <a:ext cx="5334000" cy="2963333"/>
+                    </a:xfrm>
+                    <a:prstGeom prst="rect">
+                      <a:avLst/>
+                    </a:prstGeom>
+                    <a:noFill/>
+                    <a:ln w="9525">
+                      <a:noFill/>
+                      <a:headEnd/>
+                      <a:tailEnd/>
+                    </a:ln>
+                  </pic:spPr>
+                </pic:pic>
+              </a:graphicData>
+            </a:graphic>
+          </wp:inline>
+        </w:drawing>
+      </w:r>
+    </w:p>
+    <w:p>
+      <w:pPr>
+        <w:pStyle w:val="ImageCaption"/>
+      </w:pPr>
       <w:r>
         <w:t xml:space="preserve">Las fusiones contienen Categorías, que contienen Subcategorías específicas centradas en el resultado.</w:t>
-      </w:r>
-      <w:r>
-        <w:t xml:space="preserve">”</w:t>
-      </w:r>
-      <w:r>
-        <w:t xml:space="preserve"> </w:t>
-      </w:r>
-      <w:r>
-        <w:t xml:space="preserve">/</w:t>
       </w:r>
     </w:p>
     <w:p>
@@ -2672,7 +2676,7 @@
         <w:t xml:space="preserve">Silencio…</w:t>
       </w:r>
     </w:p>
-    <w:bookmarkStart w:id="29" w:name="organizational-context-gv.oc"/>
+    <w:bookmarkStart w:id="35" w:name="organizational-context-gv.oc"/>
     <w:p>
       <w:pPr>
         <w:pStyle w:val="Heading2"/>
@@ -2798,8 +2802,8 @@
         <w:t xml:space="preserve">.</w:t>
       </w:r>
     </w:p>
-    <w:bookmarkEnd w:id="29"/>
-    <w:bookmarkStart w:id="30" w:name="risk-management-strategy-gv.rm"/>
+    <w:bookmarkEnd w:id="35"/>
+    <w:bookmarkStart w:id="36" w:name="risk-management-strategy-gv.rm"/>
     <w:p>
       <w:pPr>
         <w:pStyle w:val="Heading2"/>
@@ -2937,8 +2941,8 @@
         <w:t xml:space="preserve">.</w:t>
       </w:r>
     </w:p>
-    <w:bookmarkEnd w:id="30"/>
-    <w:bookmarkStart w:id="31" w:name="Xe17dd260425e60af9ee9e6615040e5d989071a8"/>
+    <w:bookmarkEnd w:id="36"/>
+    <w:bookmarkStart w:id="37" w:name="Xe17dd260425e60af9ee9e6615040e5d989071a8"/>
     <w:p>
       <w:pPr>
         <w:pStyle w:val="Heading2"/>
@@ -3058,8 +3062,8 @@
         <w:t xml:space="preserve">.</w:t>
       </w:r>
     </w:p>
-    <w:bookmarkEnd w:id="31"/>
-    <w:bookmarkStart w:id="32" w:name="policy-gv.po"/>
+    <w:bookmarkEnd w:id="37"/>
+    <w:bookmarkStart w:id="38" w:name="policy-gv.po"/>
     <w:p>
       <w:pPr>
         <w:pStyle w:val="Heading2"/>
@@ -3167,8 +3171,8 @@
         <w:t xml:space="preserve">.</w:t>
       </w:r>
     </w:p>
-    <w:bookmarkEnd w:id="32"/>
-    <w:bookmarkStart w:id="33" w:name="monitoring-gv.ov"/>
+    <w:bookmarkEnd w:id="38"/>
+    <w:bookmarkStart w:id="39" w:name="monitoring-gv.ov"/>
     <w:p>
       <w:pPr>
         <w:pStyle w:val="Heading2"/>
@@ -3282,8 +3286,8 @@
         <w:t xml:space="preserve">.</w:t>
       </w:r>
     </w:p>
-    <w:bookmarkEnd w:id="33"/>
-    <w:bookmarkStart w:id="34" w:name="Xc68eb2e698529c7f74799b986df866a06d0e82d"/>
+    <w:bookmarkEnd w:id="39"/>
+    <w:bookmarkStart w:id="40" w:name="Xc68eb2e698529c7f74799b986df866a06d0e82d"/>
     <w:p>
       <w:pPr>
         <w:pStyle w:val="Heading2"/>
@@ -3496,8 +3500,8 @@
         <w:t xml:space="preserve">Silencio.</w:t>
       </w:r>
     </w:p>
-    <w:bookmarkEnd w:id="34"/>
-    <w:bookmarkStart w:id="35" w:name="asset-management-id.am"/>
+    <w:bookmarkEnd w:id="40"/>
+    <w:bookmarkStart w:id="41" w:name="asset-management-id.am"/>
     <w:p>
       <w:pPr>
         <w:pStyle w:val="Heading2"/>
@@ -3635,8 +3639,8 @@
         <w:t xml:space="preserve">.</w:t>
       </w:r>
     </w:p>
-    <w:bookmarkEnd w:id="35"/>
-    <w:bookmarkStart w:id="36" w:name="risk-assessment-id.ra"/>
+    <w:bookmarkEnd w:id="41"/>
+    <w:bookmarkStart w:id="42" w:name="risk-assessment-id.ra"/>
     <w:p>
       <w:pPr>
         <w:pStyle w:val="Heading2"/>
@@ -3792,8 +3796,8 @@
         <w:t xml:space="preserve">.</w:t>
       </w:r>
     </w:p>
-    <w:bookmarkEnd w:id="36"/>
-    <w:bookmarkStart w:id="37" w:name="improvement-id.im"/>
+    <w:bookmarkEnd w:id="42"/>
+    <w:bookmarkStart w:id="43" w:name="improvement-id.im"/>
     <w:p>
       <w:pPr>
         <w:pStyle w:val="Heading2"/>
@@ -3970,8 +3974,8 @@
         <w:t xml:space="preserve">Silencio…</w:t>
       </w:r>
     </w:p>
-    <w:bookmarkEnd w:id="37"/>
-    <w:bookmarkStart w:id="38" w:name="Xb9eba731fe338d3cf3988bbb6e1399a73a1751c"/>
+    <w:bookmarkEnd w:id="43"/>
+    <w:bookmarkStart w:id="44" w:name="Xb9eba731fe338d3cf3988bbb6e1399a73a1751c"/>
     <w:p>
       <w:pPr>
         <w:pStyle w:val="Heading2"/>
@@ -4103,8 +4107,8 @@
         <w:t xml:space="preserve">.</w:t>
       </w:r>
     </w:p>
-    <w:bookmarkEnd w:id="38"/>
-    <w:bookmarkStart w:id="39" w:name="awareness-and-training-pr.at"/>
+    <w:bookmarkEnd w:id="44"/>
+    <w:bookmarkStart w:id="45" w:name="awareness-and-training-pr.at"/>
     <w:p>
       <w:pPr>
         <w:pStyle w:val="Heading2"/>
@@ -4212,8 +4216,8 @@
         <w:t xml:space="preserve">.</w:t>
       </w:r>
     </w:p>
-    <w:bookmarkEnd w:id="39"/>
-    <w:bookmarkStart w:id="40" w:name="data-security-pr.ds"/>
+    <w:bookmarkEnd w:id="45"/>
+    <w:bookmarkStart w:id="46" w:name="data-security-pr.ds"/>
     <w:p>
       <w:pPr>
         <w:pStyle w:val="Heading2"/>
@@ -4333,8 +4337,8 @@
         <w:t xml:space="preserve">.</w:t>
       </w:r>
     </w:p>
-    <w:bookmarkEnd w:id="40"/>
-    <w:bookmarkStart w:id="41" w:name="platform-security-pr.ps"/>
+    <w:bookmarkEnd w:id="46"/>
+    <w:bookmarkStart w:id="47" w:name="platform-security-pr.ps"/>
     <w:p>
       <w:pPr>
         <w:pStyle w:val="Heading2"/>
@@ -4466,8 +4470,8 @@
         <w:t xml:space="preserve">.</w:t>
       </w:r>
     </w:p>
-    <w:bookmarkEnd w:id="41"/>
-    <w:bookmarkStart w:id="42" w:name="Xbc69ba418f3149be27b0b766a443f18b55da042"/>
+    <w:bookmarkEnd w:id="47"/>
+    <w:bookmarkStart w:id="48" w:name="Xbc69ba418f3149be27b0b766a443f18b55da042"/>
     <w:p>
       <w:pPr>
         <w:pStyle w:val="Heading2"/>
@@ -4644,8 +4648,8 @@
         <w:t xml:space="preserve">Silencio…</w:t>
       </w:r>
     </w:p>
-    <w:bookmarkEnd w:id="42"/>
-    <w:bookmarkStart w:id="43" w:name="continuous-monitoring-de.cm"/>
+    <w:bookmarkEnd w:id="48"/>
+    <w:bookmarkStart w:id="49" w:name="continuous-monitoring-de.cm"/>
     <w:p>
       <w:pPr>
         <w:pStyle w:val="Heading2"/>
@@ -4771,8 +4775,8 @@
         <w:t xml:space="preserve">.</w:t>
       </w:r>
     </w:p>
-    <w:bookmarkEnd w:id="43"/>
-    <w:bookmarkStart w:id="44" w:name="adverse-event-analysis-de.ae"/>
+    <w:bookmarkEnd w:id="49"/>
+    <w:bookmarkStart w:id="50" w:name="adverse-event-analysis-de.ae"/>
     <w:p>
       <w:pPr>
         <w:pStyle w:val="Heading2"/>
@@ -4961,8 +4965,8 @@
         <w:t xml:space="preserve">Silencio.</w:t>
       </w:r>
     </w:p>
-    <w:bookmarkEnd w:id="44"/>
-    <w:bookmarkStart w:id="45" w:name="incident-management-rs.ma"/>
+    <w:bookmarkEnd w:id="50"/>
+    <w:bookmarkStart w:id="51" w:name="incident-management-rs.ma"/>
     <w:p>
       <w:pPr>
         <w:pStyle w:val="Heading2"/>
@@ -5088,8 +5092,8 @@
         <w:t xml:space="preserve">.</w:t>
       </w:r>
     </w:p>
-    <w:bookmarkEnd w:id="45"/>
-    <w:bookmarkStart w:id="46" w:name="incident-analysis-rs.an"/>
+    <w:bookmarkEnd w:id="51"/>
+    <w:bookmarkStart w:id="52" w:name="incident-analysis-rs.an"/>
     <w:p>
       <w:pPr>
         <w:pStyle w:val="Heading2"/>
@@ -5209,8 +5213,8 @@
         <w:t xml:space="preserve">.</w:t>
       </w:r>
     </w:p>
-    <w:bookmarkEnd w:id="46"/>
-    <w:bookmarkStart w:id="47" w:name="Xeeb46bf582eb04c8415d0ea9c1711676e9e1ea0"/>
+    <w:bookmarkEnd w:id="52"/>
+    <w:bookmarkStart w:id="53" w:name="Xeeb46bf582eb04c8415d0ea9c1711676e9e1ea0"/>
     <w:p>
       <w:pPr>
         <w:pStyle w:val="Heading2"/>
@@ -5318,8 +5322,8 @@
         <w:t xml:space="preserve">.</w:t>
       </w:r>
     </w:p>
-    <w:bookmarkEnd w:id="47"/>
-    <w:bookmarkStart w:id="48" w:name="incident-mitigation-rs.mi"/>
+    <w:bookmarkEnd w:id="53"/>
+    <w:bookmarkStart w:id="54" w:name="incident-mitigation-rs.mi"/>
     <w:p>
       <w:pPr>
         <w:pStyle w:val="Heading2"/>
@@ -5484,8 +5488,8 @@
         <w:t xml:space="preserve">Silencio…</w:t>
       </w:r>
     </w:p>
-    <w:bookmarkEnd w:id="48"/>
-    <w:bookmarkStart w:id="49" w:name="incident-recovery-plan-execution-rc.rp"/>
+    <w:bookmarkEnd w:id="54"/>
+    <w:bookmarkStart w:id="55" w:name="incident-recovery-plan-execution-rc.rp"/>
     <w:p>
       <w:pPr>
         <w:pStyle w:val="Heading2"/>
@@ -5617,8 +5621,8 @@
         <w:t xml:space="preserve">.</w:t>
       </w:r>
     </w:p>
-    <w:bookmarkEnd w:id="49"/>
-    <w:bookmarkStart w:id="50" w:name="incident-recovery-communication-rc.co"/>
+    <w:bookmarkEnd w:id="55"/>
+    <w:bookmarkStart w:id="56" w:name="incident-recovery-communication-rc.co"/>
     <w:p>
       <w:pPr>
         <w:pStyle w:val="Heading2"/>
@@ -5726,9 +5730,9 @@
         <w:t xml:space="preserve">.</w:t>
       </w:r>
     </w:p>
-    <w:bookmarkEnd w:id="50"/>
-    <w:bookmarkEnd w:id="51"/>
-    <w:bookmarkStart w:id="55" w:name="perfiles-organizacionales"/>
+    <w:bookmarkEnd w:id="56"/>
+    <w:bookmarkEnd w:id="57"/>
+    <w:bookmarkStart w:id="64" w:name="perfiles-organizacionales"/>
     <w:p>
       <w:pPr>
         <w:pStyle w:val="Heading1"/>
@@ -5754,50 +5758,58 @@
     </w:p>
     <w:p>
       <w:pPr>
-        <w:pStyle w:val="BodyText"/>
-      </w:pPr>
-      <w:r>
-        <w:t xml:space="preserve">■img src=</w:t>
-      </w:r>
-      <w:r>
-        <w:t xml:space="preserve">“</w:t>
-      </w:r>
-      <w:r>
-        <w:t xml:space="preserve">media/image3.png</w:t>
-      </w:r>
-      <w:r>
-        <w:t xml:space="preserve">”</w:t>
-      </w:r>
-      <w:r>
-        <w:t xml:space="preserve"> </w:t>
-      </w:r>
-      <w:r>
-        <w:t xml:space="preserve">style=</w:t>
-      </w:r>
-      <w:r>
-        <w:t xml:space="preserve">“</w:t>
-      </w:r>
-      <w:r>
-        <w:t xml:space="preserve">width:6.15in;height:3.39605in</w:t>
-      </w:r>
-      <w:r>
-        <w:t xml:space="preserve">”</w:t>
-      </w:r>
-      <w:r>
-        <w:t xml:space="preserve"> </w:t>
-      </w:r>
-      <w:r>
-        <w:t xml:space="preserve">alt=</w:t>
-      </w:r>
-      <w:r>
-        <w:t xml:space="preserve">“</w:t>
-      </w:r>
+        <w:pStyle w:val="CaptionedFigure"/>
+      </w:pPr>
+      <w:r>
+        <w:drawing>
+          <wp:inline>
+            <wp:extent cx="5334000" cy="2963333"/>
+            <wp:effectExtent b="0" l="0" r="0" t="0"/>
+            <wp:docPr descr="A Target Profile es útil cuando sus brechas se convierten en acción de propiedad, financiada y basada en el riesgo." title="" id="59" name="Picture"/>
+            <a:graphic>
+              <a:graphicData uri="http://schemas.openxmlformats.org/drawingml/2006/picture">
+                <pic:pic>
+                  <pic:nvPicPr>
+                    <pic:cNvPr descr="media/image3_es-419.png" id="60" name="Picture"/>
+                    <pic:cNvPicPr>
+                      <a:picLocks noChangeArrowheads="1" noChangeAspect="1"/>
+                    </pic:cNvPicPr>
+                  </pic:nvPicPr>
+                  <pic:blipFill>
+                    <a:blip r:embed="rId58"/>
+                    <a:stretch>
+                      <a:fillRect/>
+                    </a:stretch>
+                  </pic:blipFill>
+                  <pic:spPr bwMode="auto">
+                    <a:xfrm>
+                      <a:off x="0" y="0"/>
+                      <a:ext cx="5334000" cy="2963333"/>
+                    </a:xfrm>
+                    <a:prstGeom prst="rect">
+                      <a:avLst/>
+                    </a:prstGeom>
+                    <a:noFill/>
+                    <a:ln w="9525">
+                      <a:noFill/>
+                      <a:headEnd/>
+                      <a:tailEnd/>
+                    </a:ln>
+                  </pic:spPr>
+                </pic:pic>
+              </a:graphicData>
+            </a:graphic>
+          </wp:inline>
+        </w:drawing>
+      </w:r>
+    </w:p>
+    <w:p>
+      <w:pPr>
+        <w:pStyle w:val="ImageCaption"/>
+      </w:pPr>
       <w:r>
         <w:t xml:space="preserve">A Target Profile es útil cuando sus brechas se convierten en acción de propiedad, financiada y basada en el riesgo.</w:t>
       </w:r>
-      <w:r>
-        <w:t xml:space="preserve">”</w:t>
-      </w:r>
     </w:p>
     <w:p>
       <w:pPr>
@@ -5807,7 +5819,7 @@
         <w:t xml:space="preserve">Gráfico 3 Perfil actual del plan de acción</w:t>
       </w:r>
     </w:p>
-    <w:bookmarkStart w:id="52" w:name="declaración-de-alcance-del-perfil"/>
+    <w:bookmarkStart w:id="61" w:name="declaración-de-alcance-del-perfil"/>
     <w:p>
       <w:pPr>
         <w:pStyle w:val="Heading2"/>
@@ -5882,8 +5894,8 @@
         <w:t xml:space="preserve">Sumas, exclusiones, dependencias y limitaciones</w:t>
       </w:r>
     </w:p>
-    <w:bookmarkEnd w:id="52"/>
-    <w:bookmarkStart w:id="53" w:name="outcome-status"/>
+    <w:bookmarkEnd w:id="61"/>
+    <w:bookmarkStart w:id="62" w:name="outcome-status"/>
     <w:p>
       <w:pPr>
         <w:pStyle w:val="Heading2"/>
@@ -5946,8 +5958,8 @@
         <w:t xml:space="preserve">Silencio No evaluado Silencio La evidencia no es suficiente para una conclusión</w:t>
       </w:r>
     </w:p>
-    <w:bookmarkEnd w:id="53"/>
-    <w:bookmarkStart w:id="54" w:name="gap-prioritization"/>
+    <w:bookmarkEnd w:id="62"/>
+    <w:bookmarkStart w:id="63" w:name="gap-prioritization"/>
     <w:p>
       <w:pPr>
         <w:pStyle w:val="Heading2"/>
@@ -5964,9 +5976,9 @@
         <w:t xml:space="preserve">Priorizar las lagunas que utilizan el impacto de la misión, la probabilidad de amenaza, la crítica de activos, las obligaciones jurídicas y contractuales, la exposición, las dependencias, la seguridad, la privacidad, los controles actuales, el tiempo para explotar, el esfuerzo de rehabilitación y los recursos disponibles. No clasificar las brechas sólo por la etiqueta de gravedad del escáner.</w:t>
       </w:r>
     </w:p>
-    <w:bookmarkEnd w:id="54"/>
-    <w:bookmarkEnd w:id="55"/>
-    <w:bookmarkStart w:id="56" w:name="csf-tiros"/>
+    <w:bookmarkEnd w:id="63"/>
+    <w:bookmarkEnd w:id="64"/>
+    <w:bookmarkStart w:id="65" w:name="csf-tiros"/>
     <w:p>
       <w:pPr>
         <w:pStyle w:val="Heading1"/>
@@ -6134,8 +6146,8 @@
         <w:t xml:space="preserve">Evaluar cuando el riesgo, la misión, los proveedores o la tecnología cambia materialmente.</w:t>
       </w:r>
     </w:p>
-    <w:bookmarkEnd w:id="56"/>
-    <w:bookmarkStart w:id="59" w:name="X9f06961296a18263a57aef4e2105a780ea053dc"/>
+    <w:bookmarkEnd w:id="65"/>
+    <w:bookmarkStart w:id="71" w:name="X9f06961296a18263a57aef4e2105a780ea053dc"/>
     <w:p>
       <w:pPr>
         <w:pStyle w:val="Heading1"/>
@@ -6216,7 +6228,7 @@
         <w:t xml:space="preserve">tención Riesgo positivo ← Opportunity que puede mejorar los objetivos tención Automatización segura que reduce el error y mejora la velocidad de detección</w:t>
       </w:r>
     </w:p>
-    <w:bookmarkStart w:id="57" w:name="declaración-de-riesgo-ejecutivo"/>
+    <w:bookmarkStart w:id="66" w:name="declaración-de-riesgo-ejecutivo"/>
     <w:p>
       <w:pPr>
         <w:pStyle w:val="Heading2"/>
@@ -6255,8 +6267,8 @@
         <w:t xml:space="preserve">Silencio.</w:t>
       </w:r>
     </w:p>
-    <w:bookmarkEnd w:id="57"/>
-    <w:bookmarkStart w:id="58" w:name="cuestiones-a-nivel-de-la-junta"/>
+    <w:bookmarkEnd w:id="66"/>
+    <w:bookmarkStart w:id="70" w:name="cuestiones-a-nivel-de-la-junta"/>
     <w:p>
       <w:pPr>
         <w:pStyle w:val="Heading2"/>
@@ -6368,144 +6380,149 @@
     </w:p>
     <w:p>
       <w:pPr>
+        <w:pStyle w:val="CaptionedFigure"/>
+      </w:pPr>
+      <w:r>
+        <w:drawing>
+          <wp:inline>
+            <wp:extent cx="5334000" cy="2963333"/>
+            <wp:effectExtent b="0" l="0" r="0" t="0"/>
+            <wp:docPr descr="Plan, select, contract, monitor, y salida con responsabilidades de seguridad definidas" title="" id="68" name="Picture"/>
+            <a:graphic>
+              <a:graphicData uri="http://schemas.openxmlformats.org/drawingml/2006/picture">
+                <pic:pic>
+                  <pic:nvPicPr>
+                    <pic:cNvPr descr="media/image4_es-419.png" id="69" name="Picture"/>
+                    <pic:cNvPicPr>
+                      <a:picLocks noChangeArrowheads="1" noChangeAspect="1"/>
+                    </pic:cNvPicPr>
+                  </pic:nvPicPr>
+                  <pic:blipFill>
+                    <a:blip r:embed="rId67"/>
+                    <a:stretch>
+                      <a:fillRect/>
+                    </a:stretch>
+                  </pic:blipFill>
+                  <pic:spPr bwMode="auto">
+                    <a:xfrm>
+                      <a:off x="0" y="0"/>
+                      <a:ext cx="5334000" cy="2963333"/>
+                    </a:xfrm>
+                    <a:prstGeom prst="rect">
+                      <a:avLst/>
+                    </a:prstGeom>
+                    <a:noFill/>
+                    <a:ln w="9525">
+                      <a:noFill/>
+                      <a:headEnd/>
+                      <a:tailEnd/>
+                    </a:ln>
+                  </pic:spPr>
+                </pic:pic>
+              </a:graphicData>
+            </a:graphic>
+          </wp:inline>
+        </w:drawing>
+      </w:r>
+    </w:p>
+    <w:p>
+      <w:pPr>
+        <w:pStyle w:val="ImageCaption"/>
+      </w:pPr>
+      <w:r>
+        <w:t xml:space="preserve">Plan, select, contract, monitor, y salida con responsabilidades de seguridad definidas</w:t>
+      </w:r>
+    </w:p>
+    <w:p>
+      <w:pPr>
+        <w:pStyle w:val="BodyText"/>
+      </w:pPr>
+      <w:r>
+        <w:t xml:space="preserve">Gráfico 5 Ciclo de vida de ciberseguridad en cadena de suministro</w:t>
+      </w:r>
+    </w:p>
+    <w:p>
+      <w:pPr>
+        <w:numPr>
+          <w:ilvl w:val="0"/>
+          <w:numId w:val="1016"/>
+        </w:numPr>
+      </w:pPr>
+      <w:r>
+        <w:t xml:space="preserve">Proveedores de inventario, subcontratistas, productos, servicios, flujos de datos, acceso, ubicaciones y dependencias.</w:t>
+      </w:r>
+    </w:p>
+    <w:p>
+      <w:pPr>
+        <w:numPr>
+          <w:ilvl w:val="0"/>
+          <w:numId w:val="1016"/>
+        </w:numPr>
+      </w:pPr>
+      <w:r>
+        <w:t xml:space="preserve">Relaciones más estrechas por crítica, sensibilidad, acceso, sustitución, concentración, seguridad e impacto operacional.</w:t>
+      </w:r>
+    </w:p>
+    <w:p>
+      <w:pPr>
+        <w:numPr>
+          <w:ilvl w:val="0"/>
+          <w:numId w:val="1016"/>
+        </w:numPr>
+      </w:pPr>
+      <w:r>
+        <w:t xml:space="preserve">Realizar diligencia debida proporcional antes de la compra o renovación.</w:t>
+      </w:r>
+    </w:p>
+    <w:p>
+      <w:pPr>
+        <w:numPr>
+          <w:ilvl w:val="0"/>
+          <w:numId w:val="1016"/>
+        </w:numPr>
+      </w:pPr>
+      <w:r>
+        <w:t xml:space="preserve">Colocar funciones de ciberseguridad, incidentes, notificación, pruebas, subcontratistas, resiliencia, retorno y destrucción mensurables en los acuerdos.</w:t>
+      </w:r>
+    </w:p>
+    <w:p>
+      <w:pPr>
+        <w:numPr>
+          <w:ilvl w:val="0"/>
+          <w:numId w:val="1016"/>
+        </w:numPr>
+      </w:pPr>
+      <w:r>
+        <w:t xml:space="preserve">Supervisar los cambios, las conclusiones, los incidentes, la salud financiera, el rendimiento de los servicios y las dependencias materiales de cuartas partes.</w:t>
+      </w:r>
+    </w:p>
+    <w:p>
+      <w:pPr>
+        <w:numPr>
+          <w:ilvl w:val="0"/>
+          <w:numId w:val="1016"/>
+        </w:numPr>
+      </w:pPr>
+      <w:r>
+        <w:t xml:space="preserve">Incluir a terceros críticos en ejercicios, respuesta, recuperación y comunicación.</w:t>
+      </w:r>
+    </w:p>
+    <w:p>
+      <w:pPr>
+        <w:numPr>
+          <w:ilvl w:val="0"/>
+          <w:numId w:val="1016"/>
+        </w:numPr>
+      </w:pPr>
+      <w:r>
+        <w:t xml:space="preserve">Al salir, eliminar el acceso, recuperar activos, devolver o destruir datos, transferir conocimientos, conservar los registros necesarios y validar la terminación.</w:t>
+      </w:r>
+    </w:p>
+    <w:p>
+      <w:pPr>
         <w:pStyle w:val="FirstParagraph"/>
       </w:pPr>
       <w:r>
-        <w:t xml:space="preserve">יimg src=</w:t>
-      </w:r>
-      <w:r>
-        <w:t xml:space="preserve">“</w:t>
-      </w:r>
-      <w:r>
-        <w:t xml:space="preserve">media/image5.png</w:t>
-      </w:r>
-      <w:r>
-        <w:t xml:space="preserve">”</w:t>
-      </w:r>
-      <w:r>
-        <w:t xml:space="preserve"> </w:t>
-      </w:r>
-      <w:r>
-        <w:t xml:space="preserve">style=</w:t>
-      </w:r>
-      <w:r>
-        <w:t xml:space="preserve">“</w:t>
-      </w:r>
-      <w:r>
-        <w:t xml:space="preserve">width:6.15in;height:3.21373in</w:t>
-      </w:r>
-      <w:r>
-        <w:t xml:space="preserve">”</w:t>
-      </w:r>
-      <w:r>
-        <w:t xml:space="preserve"> </w:t>
-      </w:r>
-      <w:r>
-        <w:t xml:space="preserve">alt=</w:t>
-      </w:r>
-      <w:r>
-        <w:t xml:space="preserve">“</w:t>
-      </w:r>
-      <w:r>
-        <w:t xml:space="preserve">Plan, select, contract, monitor, y salida con responsabilidades de seguridad definidas</w:t>
-      </w:r>
-      <w:r>
-        <w:t xml:space="preserve">”</w:t>
-      </w:r>
-      <w:r>
-        <w:t xml:space="preserve">.</w:t>
-      </w:r>
-    </w:p>
-    <w:p>
-      <w:pPr>
-        <w:pStyle w:val="BodyText"/>
-      </w:pPr>
-      <w:r>
-        <w:t xml:space="preserve">Gráfico 5 Ciclo de vida de ciberseguridad en cadena de suministro</w:t>
-      </w:r>
-    </w:p>
-    <w:p>
-      <w:pPr>
-        <w:numPr>
-          <w:ilvl w:val="0"/>
-          <w:numId w:val="1016"/>
-        </w:numPr>
-      </w:pPr>
-      <w:r>
-        <w:t xml:space="preserve">Proveedores de inventario, subcontratistas, productos, servicios, flujos de datos, acceso, ubicaciones y dependencias.</w:t>
-      </w:r>
-    </w:p>
-    <w:p>
-      <w:pPr>
-        <w:numPr>
-          <w:ilvl w:val="0"/>
-          <w:numId w:val="1016"/>
-        </w:numPr>
-      </w:pPr>
-      <w:r>
-        <w:t xml:space="preserve">Relaciones más estrechas por crítica, sensibilidad, acceso, sustitución, concentración, seguridad e impacto operacional.</w:t>
-      </w:r>
-    </w:p>
-    <w:p>
-      <w:pPr>
-        <w:numPr>
-          <w:ilvl w:val="0"/>
-          <w:numId w:val="1016"/>
-        </w:numPr>
-      </w:pPr>
-      <w:r>
-        <w:t xml:space="preserve">Realizar diligencia debida proporcional antes de la compra o renovación.</w:t>
-      </w:r>
-    </w:p>
-    <w:p>
-      <w:pPr>
-        <w:numPr>
-          <w:ilvl w:val="0"/>
-          <w:numId w:val="1016"/>
-        </w:numPr>
-      </w:pPr>
-      <w:r>
-        <w:t xml:space="preserve">Colocar funciones de ciberseguridad, incidentes, notificación, pruebas, subcontratistas, resiliencia, retorno y destrucción mensurables en los acuerdos.</w:t>
-      </w:r>
-    </w:p>
-    <w:p>
-      <w:pPr>
-        <w:numPr>
-          <w:ilvl w:val="0"/>
-          <w:numId w:val="1016"/>
-        </w:numPr>
-      </w:pPr>
-      <w:r>
-        <w:t xml:space="preserve">Supervisar los cambios, las conclusiones, los incidentes, la salud financiera, el rendimiento de los servicios y las dependencias materiales de cuartas partes.</w:t>
-      </w:r>
-    </w:p>
-    <w:p>
-      <w:pPr>
-        <w:numPr>
-          <w:ilvl w:val="0"/>
-          <w:numId w:val="1016"/>
-        </w:numPr>
-      </w:pPr>
-      <w:r>
-        <w:t xml:space="preserve">Incluir a terceros críticos en ejercicios, respuesta, recuperación y comunicación.</w:t>
-      </w:r>
-    </w:p>
-    <w:p>
-      <w:pPr>
-        <w:numPr>
-          <w:ilvl w:val="0"/>
-          <w:numId w:val="1016"/>
-        </w:numPr>
-      </w:pPr>
-      <w:r>
-        <w:t xml:space="preserve">Al salir, eliminar el acceso, recuperar activos, devolver o destruir datos, transferir conocimientos, conservar los registros necesarios y validar la terminación.</w:t>
-      </w:r>
-    </w:p>
-    <w:p>
-      <w:pPr>
-        <w:pStyle w:val="FirstParagraph"/>
-      </w:pPr>
-      <w:r>
         <w:t xml:space="preserve">Silencio</w:t>
       </w:r>
       <w:r>
@@ -6531,9 +6548,9 @@
         <w:t xml:space="preserve">Silencio.</w:t>
       </w:r>
     </w:p>
-    <w:bookmarkEnd w:id="58"/>
-    <w:bookmarkEnd w:id="59"/>
-    <w:bookmarkStart w:id="61" w:name="métricas-pruebas-y-informes"/>
+    <w:bookmarkEnd w:id="70"/>
+    <w:bookmarkEnd w:id="71"/>
+    <w:bookmarkStart w:id="73" w:name="métricas-pruebas-y-informes"/>
     <w:p>
       <w:pPr>
         <w:pStyle w:val="Heading1"/>
@@ -6639,7 +6656,7 @@
         <w:t xml:space="preserve">Figure 6. Outcome-to-evidence chain</w:t>
       </w:r>
     </w:p>
-    <w:bookmarkStart w:id="60" w:name="calidad-de-la-evidencia"/>
+    <w:bookmarkStart w:id="72" w:name="calidad-de-la-evidencia"/>
     <w:p>
       <w:pPr>
         <w:pStyle w:val="Heading2"/>
@@ -6680,9 +6697,9 @@
         <w:t xml:space="preserve">tención Strong Silencio Datos del sistema más revisión independiente, decisiones, acción correctiva, y retest ¦</w:t>
       </w:r>
     </w:p>
-    <w:bookmarkEnd w:id="60"/>
-    <w:bookmarkEnd w:id="61"/>
-    <w:bookmarkStart w:id="101" w:name="X27891684f0f9470f13799123d0007fd728bde14"/>
+    <w:bookmarkEnd w:id="72"/>
+    <w:bookmarkEnd w:id="73"/>
+    <w:bookmarkStart w:id="116" w:name="X27891684f0f9470f13799123d0007fd728bde14"/>
     <w:p>
       <w:pPr>
         <w:pStyle w:val="Heading1"/>
@@ -6821,7 +6838,7 @@
         <w:t xml:space="preserve">Reprueba la corrección en toda la población afectada y escribe una conclusión clara con limitaciones.</w:t>
       </w:r>
     </w:p>
-    <w:bookmarkStart w:id="62" w:name="pruebas-de-verificación-práctica"/>
+    <w:bookmarkStart w:id="74" w:name="pruebas-de-verificación-práctica"/>
     <w:p>
       <w:pPr>
         <w:pStyle w:val="Heading2"/>
@@ -6899,8 +6916,8 @@
         <w:t xml:space="preserve">Silencio Desarrollo seguro Silencio Todos los repositorios, liberaciones, dependencias, excepciones, y hallazgos ¦ Requisitos de examen, revisión, escaneo, secretos, dependencias, aprobación, implementación, corrección, y retestigos de los diarios de Pipeline, revisión, escaneo, ticket, liberación y validación</w:t>
       </w:r>
     </w:p>
-    <w:bookmarkEnd w:id="62"/>
-    <w:bookmarkStart w:id="63" w:name="conclusion-language"/>
+    <w:bookmarkEnd w:id="74"/>
+    <w:bookmarkStart w:id="78" w:name="conclusion-language"/>
     <w:p>
       <w:pPr>
         <w:pStyle w:val="Heading2"/>
@@ -6961,50 +6978,58 @@
     </w:p>
     <w:p>
       <w:pPr>
-        <w:pStyle w:val="BodyText"/>
-      </w:pPr>
-      <w:r>
-        <w:t xml:space="preserve">■img src=</w:t>
-      </w:r>
-      <w:r>
-        <w:t xml:space="preserve">“</w:t>
-      </w:r>
-      <w:r>
-        <w:t xml:space="preserve">media/image7.png</w:t>
-      </w:r>
-      <w:r>
-        <w:t xml:space="preserve">”</w:t>
-      </w:r>
-      <w:r>
-        <w:t xml:space="preserve"> </w:t>
-      </w:r>
-      <w:r>
-        <w:t xml:space="preserve">estilo=</w:t>
-      </w:r>
-      <w:r>
-        <w:t xml:space="preserve">“</w:t>
-      </w:r>
-      <w:r>
-        <w:t xml:space="preserve">Ancho:6.15in; Altura:3.39605in</w:t>
-      </w:r>
-      <w:r>
-        <w:t xml:space="preserve">”</w:t>
-      </w:r>
-      <w:r>
-        <w:t xml:space="preserve"> </w:t>
-      </w:r>
-      <w:r>
-        <w:t xml:space="preserve">alt=</w:t>
-      </w:r>
-      <w:r>
-        <w:t xml:space="preserve">“</w:t>
-      </w:r>
+        <w:pStyle w:val="CaptionedFigure"/>
+      </w:pPr>
+      <w:r>
+        <w:drawing>
+          <wp:inline>
+            <wp:extent cx="5334000" cy="2963333"/>
+            <wp:effectExtent b="0" l="0" r="0" t="0"/>
+            <wp:docPr descr="Autorización, validación, acción correctiva, y retesting convierten la producción técnica en evidencia útil." title="" id="76" name="Picture"/>
+            <a:graphic>
+              <a:graphicData uri="http://schemas.openxmlformats.org/drawingml/2006/picture">
+                <pic:pic>
+                  <pic:nvPicPr>
+                    <pic:cNvPr descr="media/image5_es-419.png" id="77" name="Picture"/>
+                    <pic:cNvPicPr>
+                      <a:picLocks noChangeArrowheads="1" noChangeAspect="1"/>
+                    </pic:cNvPicPr>
+                  </pic:nvPicPr>
+                  <pic:blipFill>
+                    <a:blip r:embed="rId75"/>
+                    <a:stretch>
+                      <a:fillRect/>
+                    </a:stretch>
+                  </pic:blipFill>
+                  <pic:spPr bwMode="auto">
+                    <a:xfrm>
+                      <a:off x="0" y="0"/>
+                      <a:ext cx="5334000" cy="2963333"/>
+                    </a:xfrm>
+                    <a:prstGeom prst="rect">
+                      <a:avLst/>
+                    </a:prstGeom>
+                    <a:noFill/>
+                    <a:ln w="9525">
+                      <a:noFill/>
+                      <a:headEnd/>
+                      <a:tailEnd/>
+                    </a:ln>
+                  </pic:spPr>
+                </pic:pic>
+              </a:graphicData>
+            </a:graphic>
+          </wp:inline>
+        </w:drawing>
+      </w:r>
+    </w:p>
+    <w:p>
+      <w:pPr>
+        <w:pStyle w:val="ImageCaption"/>
+      </w:pPr>
       <w:r>
         <w:t xml:space="preserve">Autorización, validación, acción correctiva, y retesting convierten la producción técnica en evidencia útil.</w:t>
       </w:r>
-      <w:r>
-        <w:t xml:space="preserve">”</w:t>
-      </w:r>
     </w:p>
     <w:p>
       <w:pPr>
@@ -7110,8 +7135,8 @@
         <w:t xml:space="preserve">TEN OpenSearch TENIDO Buscar, análisis, tableros de instrumentos y monitoreo de seguridad TENIDO DE.CM, DE.AE, GV.OV ANTE</w:t>
       </w:r>
     </w:p>
-    <w:bookmarkEnd w:id="63"/>
-    <w:bookmarkStart w:id="64" w:name="X27c8a08910d8eb682202b0b8017ecf36a6791c1"/>
+    <w:bookmarkEnd w:id="78"/>
+    <w:bookmarkStart w:id="79" w:name="X27c8a08910d8eb682202b0b8017ecf36a6791c1"/>
     <w:p>
       <w:pPr>
         <w:pStyle w:val="Heading2"/>
@@ -7208,8 +7233,8 @@
         <w:t xml:space="preserve">Revalidate después de actualizaciones de materiales, cambios de integración, cambios de configuración o fallos.</w:t>
       </w:r>
     </w:p>
-    <w:bookmarkEnd w:id="64"/>
-    <w:bookmarkStart w:id="66" w:name="ciso-assistant"/>
+    <w:bookmarkEnd w:id="79"/>
+    <w:bookmarkStart w:id="81" w:name="ciso-assistant"/>
     <w:p>
       <w:pPr>
         <w:pStyle w:val="Heading2"/>
@@ -7244,7 +7269,7 @@
         <w:t xml:space="preserve">Abra la guía oficial de asistentes CISO(https://intuitem.gitbook.io/ciso-assistant)</w:t>
       </w:r>
     </w:p>
-    <w:bookmarkStart w:id="65" w:name="quick-start"/>
+    <w:bookmarkStart w:id="80" w:name="quick-start"/>
     <w:p>
       <w:pPr>
         <w:pStyle w:val="Heading3"/>
@@ -7259,371 +7284,11 @@
       </w:pPr>
       <w:r>
         <w:t xml:space="preserve">Cree una organización ficticia, seleccione cinco resultados CSF, asigne propietarios, adjunte pruebas sanitarias, registre una brecha y construya un plan de acción.</w:t>
-      </w:r>
-    </w:p>
-    <w:bookmarkEnd w:id="65"/>
-    <w:bookmarkEnd w:id="66"/>
-    <w:bookmarkStart w:id="67" w:name="evidencia-y-limitación"/>
-    <w:p>
-      <w:pPr>
-        <w:pStyle w:val="Heading2"/>
-      </w:pPr>
-      <w:r>
-        <w:t xml:space="preserve">Evidencia y limitación</w:t>
-      </w:r>
-    </w:p>
-    <w:p>
-      <w:pPr>
-        <w:pStyle w:val="FirstParagraph"/>
-      </w:pPr>
-      <w:r>
-        <w:t xml:space="preserve">Retener autorización, alcance, población objetivo, versión de herramientas y contenidos, configuración, resultado bruto, revisor, decisión, acción correctiva, excepción y retest. La herramienta admite trabajo seleccionado; no puede certificar la alineación CSF, determinar el alcance completo o reemplazar el juicio humano calificado.</w:t>
-      </w:r>
-    </w:p>
-    <w:bookmarkEnd w:id="67"/>
-    <w:bookmarkStart w:id="69" w:name="wazuh"/>
-    <w:p>
-      <w:pPr>
-        <w:pStyle w:val="Heading2"/>
-      </w:pPr>
-      <w:r>
-        <w:t xml:space="preserve">16.3 Wazuh</w:t>
-      </w:r>
-    </w:p>
-    <w:p>
-      <w:pPr>
-        <w:pStyle w:val="FirstParagraph"/>
-      </w:pPr>
-      <w:r>
-        <w:t xml:space="preserve">SIEM, control de puntos finales, integridad. Posible apoyo CSF: DE.CM, DE.AE, RS.MA.</w:t>
-      </w:r>
-    </w:p>
-    <w:p>
-      <w:pPr>
-        <w:pStyle w:val="BodyText"/>
-      </w:pPr>
-      <w:r>
-        <w:rPr>
-          <w:bCs/>
-          <w:b/>
-        </w:rPr>
-        <w:t xml:space="preserve">Documentación oficial:</w:t>
-      </w:r>
-      <w:r>
-        <w:t xml:space="preserve"> </w:t>
-      </w:r>
-      <w:r>
-        <w:t xml:space="preserve">Abra la guía oficial Wazuh realizada/u título](https://documentation.wazuh.com/current/quickstart.html)</w:t>
-      </w:r>
-    </w:p>
-    <w:bookmarkStart w:id="68" w:name="quick-start-1"/>
-    <w:p>
-      <w:pPr>
-        <w:pStyle w:val="Heading3"/>
-      </w:pPr>
-      <w:r>
-        <w:t xml:space="preserve">Quick start</w:t>
-      </w:r>
-    </w:p>
-    <w:p>
-      <w:pPr>
-        <w:pStyle w:val="FirstParagraph"/>
-      </w:pPr>
-      <w:r>
-        <w:t xml:space="preserve">Conectar un punto final autorizado de laboratorio, crear un evento inofensivo, revisar la alerta, documentar la decisión y retener el evento y el ticket.</w:t>
-      </w:r>
-    </w:p>
-    <w:bookmarkEnd w:id="68"/>
-    <w:bookmarkEnd w:id="69"/>
-    <w:bookmarkStart w:id="70" w:name="evidencia-y-limitación-1"/>
-    <w:p>
-      <w:pPr>
-        <w:pStyle w:val="Heading2"/>
-      </w:pPr>
-      <w:r>
-        <w:t xml:space="preserve">Evidencia y limitación</w:t>
-      </w:r>
-    </w:p>
-    <w:p>
-      <w:pPr>
-        <w:pStyle w:val="FirstParagraph"/>
-      </w:pPr>
-      <w:r>
-        <w:t xml:space="preserve">Retener autorización, alcance, población objetivo, versión de herramientas y contenidos, configuración, resultado bruto, revisor, decisión, acción correctiva, excepción y retest. La herramienta admite trabajo seleccionado; no puede certificar la alineación CSF, determinar el alcance completo o reemplazar el juicio humano calificado.</w:t>
-      </w:r>
-    </w:p>
-    <w:bookmarkEnd w:id="70"/>
-    <w:bookmarkStart w:id="72" w:name="osquery"/>
-    <w:p>
-      <w:pPr>
-        <w:pStyle w:val="Heading2"/>
-      </w:pPr>
-      <w:r>
-        <w:t xml:space="preserve">16.4 osquery</w:t>
-      </w:r>
-    </w:p>
-    <w:p>
-      <w:pPr>
-        <w:pStyle w:val="FirstParagraph"/>
-      </w:pPr>
-      <w:r>
-        <w:t xml:space="preserve">Inventario de endpoint y pruebas de consulta. Posible apoyo CSF: ID.AM, PR.PS, PR.AA.</w:t>
-      </w:r>
-    </w:p>
-    <w:p>
-      <w:pPr>
-        <w:pStyle w:val="BodyText"/>
-      </w:pPr>
-      <w:r>
-        <w:rPr>
-          <w:bCs/>
-          <w:b/>
-        </w:rPr>
-        <w:t xml:space="preserve">Documentación oficial:</w:t>
-      </w:r>
-      <w:r>
-        <w:t xml:space="preserve"> </w:t>
-      </w:r>
-      <w:r>
-        <w:t xml:space="preserve">[Seguido]Abre la guía oficial del osquery realizada/u contacto](https://osquery.readthedocs.io/en/stable/)</w:t>
-      </w:r>
-    </w:p>
-    <w:bookmarkStart w:id="71" w:name="quick-start-2"/>
-    <w:p>
-      <w:pPr>
-        <w:pStyle w:val="Heading3"/>
-      </w:pPr>
-      <w:r>
-        <w:t xml:space="preserve">Quick start</w:t>
-      </w:r>
-    </w:p>
-    <w:p>
-      <w:pPr>
-        <w:pStyle w:val="FirstParagraph"/>
-      </w:pPr>
-      <w:r>
-        <w:t xml:space="preserve">Query users, software, servicios, cifrado o procesos en un endpoint de laboratorio; registro de consultas, host, tiempo, salida y revisión.</w:t>
-      </w:r>
-    </w:p>
-    <w:bookmarkEnd w:id="71"/>
-    <w:bookmarkEnd w:id="72"/>
-    <w:bookmarkStart w:id="73" w:name="evidencia-y-limitación-2"/>
-    <w:p>
-      <w:pPr>
-        <w:pStyle w:val="Heading2"/>
-      </w:pPr>
-      <w:r>
-        <w:t xml:space="preserve">Evidencia y limitación</w:t>
-      </w:r>
-    </w:p>
-    <w:p>
-      <w:pPr>
-        <w:pStyle w:val="FirstParagraph"/>
-      </w:pPr>
-      <w:r>
-        <w:t xml:space="preserve">Retener autorización, alcance, población objetivo, versión de herramientas y contenidos, configuración, resultado bruto, revisor, decisión, acción correctiva, excepción y retest. La herramienta admite trabajo seleccionado; no puede certificar la alineación CSF, determinar el alcance completo o reemplazar el juicio humano calificado.</w:t>
-      </w:r>
-    </w:p>
-    <w:bookmarkEnd w:id="73"/>
-    <w:bookmarkStart w:id="75" w:name="openscap"/>
-    <w:p>
-      <w:pPr>
-        <w:pStyle w:val="Heading2"/>
-      </w:pPr>
-      <w:r>
-        <w:t xml:space="preserve">16.5 OpenSCAP</w:t>
-      </w:r>
-    </w:p>
-    <w:p>
-      <w:pPr>
-        <w:pStyle w:val="FirstParagraph"/>
-      </w:pPr>
-      <w:r>
-        <w:t xml:space="preserve">Evaluación de configuración de Linux. Posible soporte CSF: PR.PS, ID.IM.</w:t>
-      </w:r>
-    </w:p>
-    <w:p>
-      <w:pPr>
-        <w:pStyle w:val="BodyText"/>
-      </w:pPr>
-      <w:r>
-        <w:rPr>
-          <w:bCs/>
-          <w:b/>
-        </w:rPr>
-        <w:t xml:space="preserve">Documentación oficial:</w:t>
-      </w:r>
-      <w:r>
-        <w:t xml:space="preserve"> </w:t>
-      </w:r>
-      <w:r>
-        <w:t xml:space="preserve">[Seguido]Abre la guía oficial OpenSCAP efectuada/u contacto](https://www.open-scap.org/getting-started/)</w:t>
-      </w:r>
-    </w:p>
-    <w:bookmarkStart w:id="74" w:name="quick-start-3"/>
-    <w:p>
-      <w:pPr>
-        <w:pStyle w:val="Heading3"/>
-      </w:pPr>
-      <w:r>
-        <w:t xml:space="preserve">Quick start</w:t>
-      </w:r>
-    </w:p>
-    <w:p>
-      <w:pPr>
-        <w:pStyle w:val="FirstParagraph"/>
-      </w:pPr>
-      <w:r>
-        <w:t xml:space="preserve">Evaluar un laboratorio Linux autorizado contra un perfil adecuado, corregir un ajuste aprobado, y comparar el antes y después de los informes.</w:t>
-      </w:r>
-    </w:p>
-    <w:bookmarkEnd w:id="74"/>
-    <w:bookmarkEnd w:id="75"/>
-    <w:bookmarkStart w:id="76" w:name="evidencia-y-limitación-3"/>
-    <w:p>
-      <w:pPr>
-        <w:pStyle w:val="Heading2"/>
-      </w:pPr>
-      <w:r>
-        <w:t xml:space="preserve">Evidencia y limitación</w:t>
-      </w:r>
-    </w:p>
-    <w:p>
-      <w:pPr>
-        <w:pStyle w:val="FirstParagraph"/>
-      </w:pPr>
-      <w:r>
-        <w:t xml:space="preserve">Retener autorización, alcance, población objetivo, versión de herramientas y contenidos, configuración, resultado bruto, revisor, decisión, acción correctiva, excepción y retest. La herramienta admite trabajo seleccionado; no puede certificar la alineación CSF, determinar el alcance completo o reemplazar el juicio humano calificado.</w:t>
-      </w:r>
-    </w:p>
-    <w:bookmarkEnd w:id="76"/>
-    <w:bookmarkStart w:id="78" w:name="greenbone-community-edition"/>
-    <w:p>
-      <w:pPr>
-        <w:pStyle w:val="Heading2"/>
-      </w:pPr>
-      <w:r>
-        <w:t xml:space="preserve">16.6 Greenbone Community Edition</w:t>
-      </w:r>
-    </w:p>
-    <w:p>
-      <w:pPr>
-        <w:pStyle w:val="FirstParagraph"/>
-      </w:pPr>
-      <w:r>
-        <w:t xml:space="preserve">Evaluación de vulnerabilidades. Posible soporte CSF: ID.RA, ID.IM.</w:t>
-      </w:r>
-    </w:p>
-    <w:p>
-      <w:pPr>
-        <w:pStyle w:val="BodyText"/>
-      </w:pPr>
-      <w:r>
-        <w:rPr>
-          <w:bCs/>
-          <w:b/>
-        </w:rPr>
-        <w:t xml:space="preserve">Documentación oficial:</w:t>
-      </w:r>
-      <w:r>
-        <w:t xml:space="preserve"> </w:t>
-      </w:r>
-      <w:r>
-        <w:t xml:space="preserve">[Seguridad]Abre la guía oficial Greenbone Community Edition realizada/u contacto](https://greenbone.github.io/docs/latest/)</w:t>
-      </w:r>
-    </w:p>
-    <w:bookmarkStart w:id="77" w:name="quick-start-4"/>
-    <w:p>
-      <w:pPr>
-        <w:pStyle w:val="Heading3"/>
-      </w:pPr>
-      <w:r>
-        <w:t xml:space="preserve">Quick start</w:t>
-      </w:r>
-    </w:p>
-    <w:p>
-      <w:pPr>
-        <w:pStyle w:val="FirstParagraph"/>
-      </w:pPr>
-      <w:r>
-        <w:t xml:space="preserve">Escanear sólo un objetivo de laboratorio aprobado, validar un hallazgo, corregirlo, cambiar y documentar el alcance y las limitaciones.</w:t>
-      </w:r>
-    </w:p>
-    <w:bookmarkEnd w:id="77"/>
-    <w:bookmarkEnd w:id="78"/>
-    <w:bookmarkStart w:id="79" w:name="evidencia-y-limitación-4"/>
-    <w:p>
-      <w:pPr>
-        <w:pStyle w:val="Heading2"/>
-      </w:pPr>
-      <w:r>
-        <w:t xml:space="preserve">Evidencia y limitación</w:t>
-      </w:r>
-    </w:p>
-    <w:p>
-      <w:pPr>
-        <w:pStyle w:val="FirstParagraph"/>
-      </w:pPr>
-      <w:r>
-        <w:t xml:space="preserve">Retener autorización, alcance, población objetivo, versión de herramientas y contenidos, configuración, resultado bruto, revisor, decisión, acción correctiva, excepción y retest. La herramienta admite trabajo seleccionado; no puede certificar la alineación CSF, determinar el alcance completo o reemplazar el juicio humano calificado.</w:t>
-      </w:r>
-    </w:p>
-    <w:bookmarkEnd w:id="79"/>
-    <w:bookmarkStart w:id="81" w:name="trivy"/>
-    <w:p>
-      <w:pPr>
-        <w:pStyle w:val="Heading2"/>
-      </w:pPr>
-      <w:r>
-        <w:t xml:space="preserve">16.7 Trivy</w:t>
-      </w:r>
-    </w:p>
-    <w:p>
-      <w:pPr>
-        <w:pStyle w:val="FirstParagraph"/>
-      </w:pPr>
-      <w:r>
-        <w:t xml:space="preserve">Código, imagen, dependencia, secreto y análisis de configuración. Posible soporte CSF: ID.RA, PR.PS.</w:t>
-      </w:r>
-    </w:p>
-    <w:p>
-      <w:pPr>
-        <w:pStyle w:val="BodyText"/>
-      </w:pPr>
-      <w:r>
-        <w:rPr>
-          <w:bCs/>
-          <w:b/>
-        </w:rPr>
-        <w:t xml:space="preserve">Documentación oficial:</w:t>
-      </w:r>
-      <w:r>
-        <w:t xml:space="preserve"> </w:t>
-      </w:r>
-      <w:r>
-        <w:t xml:space="preserve">Abra la guía oficial Trivy realizada/u título](https://trivy.dev/latest/)</w:t>
-      </w:r>
-    </w:p>
-    <w:bookmarkStart w:id="80" w:name="quick-start-5"/>
-    <w:p>
-      <w:pPr>
-        <w:pStyle w:val="Heading3"/>
-      </w:pPr>
-      <w:r>
-        <w:t xml:space="preserve">Quick start</w:t>
-      </w:r>
-    </w:p>
-    <w:p>
-      <w:pPr>
-        <w:pStyle w:val="FirstParagraph"/>
-      </w:pPr>
-      <w:r>
-        <w:t xml:space="preserve">Escríbete una imagen de laboratorio o un repositorio de pruebas, protege el informe, valida un resultado, corrigelo y vuelve a escanear.</w:t>
       </w:r>
     </w:p>
     <w:bookmarkEnd w:id="80"/>
     <w:bookmarkEnd w:id="81"/>
-    <w:bookmarkStart w:id="82" w:name="evidencia-y-limitación-5"/>
+    <w:bookmarkStart w:id="82" w:name="evidencia-y-limitación"/>
     <w:p>
       <w:pPr>
         <w:pStyle w:val="Heading2"/>
@@ -7641,13 +7306,13 @@
       </w:r>
     </w:p>
     <w:bookmarkEnd w:id="82"/>
-    <w:bookmarkStart w:id="84" w:name="owasp-zap"/>
+    <w:bookmarkStart w:id="84" w:name="wazuh"/>
     <w:p>
       <w:pPr>
         <w:pStyle w:val="Heading2"/>
       </w:pPr>
       <w:r>
-        <w:t xml:space="preserve">16.8 OWASP ZAP</w:t>
+        <w:t xml:space="preserve">16.3 Wazuh</w:t>
       </w:r>
     </w:p>
     <w:p>
@@ -7655,7 +7320,7 @@
         <w:pStyle w:val="FirstParagraph"/>
       </w:pPr>
       <w:r>
-        <w:t xml:space="preserve">Evaluación autorizada de la aplicación web. Posible soporte CSF: ID.RA, ID.IM.</w:t>
+        <w:t xml:space="preserve">SIEM, control de puntos finales, integridad. Posible apoyo CSF: DE.CM, DE.AE, RS.MA.</w:t>
       </w:r>
     </w:p>
     <w:p>
@@ -7673,10 +7338,10 @@
         <w:t xml:space="preserve"> </w:t>
       </w:r>
       <w:r>
-        <w:t xml:space="preserve">Abra la guía oficial OWASP ZAP efectuada / u fiel](https://www.zaproxy.org/getting-started/)</w:t>
-      </w:r>
-    </w:p>
-    <w:bookmarkStart w:id="83" w:name="quick-start-6"/>
+        <w:t xml:space="preserve">Abra la guía oficial Wazuh realizada/u título](https://documentation.wazuh.com/current/quickstart.html)</w:t>
+      </w:r>
+    </w:p>
+    <w:bookmarkStart w:id="83" w:name="quick-start-1"/>
     <w:p>
       <w:pPr>
         <w:pStyle w:val="Heading3"/>
@@ -7690,12 +7355,12 @@
         <w:pStyle w:val="FirstParagraph"/>
       </w:pPr>
       <w:r>
-        <w:t xml:space="preserve">Proxy una aplicación de entrenamiento local, empezar con análisis pasivos, validar un hallazgo, y conservar el alcance y los resultados aprobados.</w:t>
+        <w:t xml:space="preserve">Conectar un punto final autorizado de laboratorio, crear un evento inofensivo, revisar la alerta, documentar la decisión y retener el evento y el ticket.</w:t>
       </w:r>
     </w:p>
     <w:bookmarkEnd w:id="83"/>
     <w:bookmarkEnd w:id="84"/>
-    <w:bookmarkStart w:id="85" w:name="evidencia-y-limitación-6"/>
+    <w:bookmarkStart w:id="85" w:name="evidencia-y-limitación-1"/>
     <w:p>
       <w:pPr>
         <w:pStyle w:val="Heading2"/>
@@ -7713,13 +7378,13 @@
       </w:r>
     </w:p>
     <w:bookmarkEnd w:id="85"/>
-    <w:bookmarkStart w:id="87" w:name="keycloak"/>
+    <w:bookmarkStart w:id="87" w:name="osquery"/>
     <w:p>
       <w:pPr>
         <w:pStyle w:val="Heading2"/>
       </w:pPr>
       <w:r>
-        <w:t xml:space="preserve">16.9 Keycloak</w:t>
+        <w:t xml:space="preserve">16.4 osquery</w:t>
       </w:r>
     </w:p>
     <w:p>
@@ -7727,7 +7392,7 @@
         <w:pStyle w:val="FirstParagraph"/>
       </w:pPr>
       <w:r>
-        <w:t xml:space="preserve">Identidad, roles, autenticación y MFA. Posible apoyo CSF: PR.AA.</w:t>
+        <w:t xml:space="preserve">Inventario de endpoint y pruebas de consulta. Posible apoyo CSF: ID.AM, PR.PS, PR.AA.</w:t>
       </w:r>
     </w:p>
     <w:p>
@@ -7745,10 +7410,10 @@
         <w:t xml:space="preserve"> </w:t>
       </w:r>
       <w:r>
-        <w:t xml:space="preserve">[ obedeció]Abre la guía oficial de Keycloak realizada/u contacto](https://www.keycloak.org/guides)</w:t>
-      </w:r>
-    </w:p>
-    <w:bookmarkStart w:id="86" w:name="quick-start-7"/>
+        <w:t xml:space="preserve">[Seguido]Abre la guía oficial del osquery realizada/u contacto](https://osquery.readthedocs.io/en/stable/)</w:t>
+      </w:r>
+    </w:p>
+    <w:bookmarkStart w:id="86" w:name="quick-start-2"/>
     <w:p>
       <w:pPr>
         <w:pStyle w:val="Heading3"/>
@@ -7762,12 +7427,12 @@
         <w:pStyle w:val="FirstParagraph"/>
       </w:pPr>
       <w:r>
-        <w:t xml:space="preserve">Crear un reino de laboratorio, usuarios, roles y MFA; probar menos privilegios, acceso fallido y eliminación; exportar evidencia de configuración sanitaria.</w:t>
+        <w:t xml:space="preserve">Query users, software, servicios, cifrado o procesos en un endpoint de laboratorio; registro de consultas, host, tiempo, salida y revisión.</w:t>
       </w:r>
     </w:p>
     <w:bookmarkEnd w:id="86"/>
     <w:bookmarkEnd w:id="87"/>
-    <w:bookmarkStart w:id="88" w:name="evidencia-y-limitación-7"/>
+    <w:bookmarkStart w:id="88" w:name="evidencia-y-limitación-2"/>
     <w:p>
       <w:pPr>
         <w:pStyle w:val="Heading2"/>
@@ -7785,13 +7450,13 @@
       </w:r>
     </w:p>
     <w:bookmarkEnd w:id="88"/>
-    <w:bookmarkStart w:id="90" w:name="defectodojo"/>
+    <w:bookmarkStart w:id="90" w:name="openscap"/>
     <w:p>
       <w:pPr>
         <w:pStyle w:val="Heading2"/>
       </w:pPr>
       <w:r>
-        <w:t xml:space="preserve">16.10 DefectoDojo</w:t>
+        <w:t xml:space="preserve">16.5 OpenSCAP</w:t>
       </w:r>
     </w:p>
     <w:p>
@@ -7799,7 +7464,7 @@
         <w:pStyle w:val="FirstParagraph"/>
       </w:pPr>
       <w:r>
-        <w:t xml:space="preserve">Encontrar captación y seguimiento de remediación. Posible apoyo CSF: ID.RA, ID.IM, GV.OV.</w:t>
+        <w:t xml:space="preserve">Evaluación de configuración de Linux. Posible soporte CSF: PR.PS, ID.IM.</w:t>
       </w:r>
     </w:p>
     <w:p>
@@ -7817,10 +7482,10 @@
         <w:t xml:space="preserve"> </w:t>
       </w:r>
       <w:r>
-        <w:t xml:space="preserve">[Seguido]Abre el defecto oficialDojo guía seleccionada/u contacto](https://docs.defectdojo.com/)</w:t>
-      </w:r>
-    </w:p>
-    <w:bookmarkStart w:id="89" w:name="quick-start-8"/>
+        <w:t xml:space="preserve">[Seguido]Abre la guía oficial OpenSCAP efectuada/u contacto](https://www.open-scap.org/getting-started/)</w:t>
+      </w:r>
+    </w:p>
+    <w:bookmarkStart w:id="89" w:name="quick-start-3"/>
     <w:p>
       <w:pPr>
         <w:pStyle w:val="Heading3"/>
@@ -7834,12 +7499,12 @@
         <w:pStyle w:val="FirstParagraph"/>
       </w:pPr>
       <w:r>
-        <w:t xml:space="preserve">Importar un informe de laboratorio, validar y asignar un hallazgo, registrar corrección, retestarlo y cerrarlo con prueba.</w:t>
+        <w:t xml:space="preserve">Evaluar un laboratorio Linux autorizado contra un perfil adecuado, corregir un ajuste aprobado, y comparar el antes y después de los informes.</w:t>
       </w:r>
     </w:p>
     <w:bookmarkEnd w:id="89"/>
     <w:bookmarkEnd w:id="90"/>
-    <w:bookmarkStart w:id="92" w:name="evidencia-y-limitación-8"/>
+    <w:bookmarkStart w:id="91" w:name="evidencia-y-limitación-3"/>
     <w:p>
       <w:pPr>
         <w:pStyle w:val="Heading2"/>
@@ -7856,6 +7521,366 @@
         <w:t xml:space="preserve">Retener autorización, alcance, población objetivo, versión de herramientas y contenidos, configuración, resultado bruto, revisor, decisión, acción correctiva, excepción y retest. La herramienta admite trabajo seleccionado; no puede certificar la alineación CSF, determinar el alcance completo o reemplazar el juicio humano calificado.</w:t>
       </w:r>
     </w:p>
+    <w:bookmarkEnd w:id="91"/>
+    <w:bookmarkStart w:id="93" w:name="greenbone-community-edition"/>
+    <w:p>
+      <w:pPr>
+        <w:pStyle w:val="Heading2"/>
+      </w:pPr>
+      <w:r>
+        <w:t xml:space="preserve">16.6 Greenbone Community Edition</w:t>
+      </w:r>
+    </w:p>
+    <w:p>
+      <w:pPr>
+        <w:pStyle w:val="FirstParagraph"/>
+      </w:pPr>
+      <w:r>
+        <w:t xml:space="preserve">Evaluación de vulnerabilidades. Posible soporte CSF: ID.RA, ID.IM.</w:t>
+      </w:r>
+    </w:p>
+    <w:p>
+      <w:pPr>
+        <w:pStyle w:val="BodyText"/>
+      </w:pPr>
+      <w:r>
+        <w:rPr>
+          <w:bCs/>
+          <w:b/>
+        </w:rPr>
+        <w:t xml:space="preserve">Documentación oficial:</w:t>
+      </w:r>
+      <w:r>
+        <w:t xml:space="preserve"> </w:t>
+      </w:r>
+      <w:r>
+        <w:t xml:space="preserve">[Seguridad]Abre la guía oficial Greenbone Community Edition realizada/u contacto](https://greenbone.github.io/docs/latest/)</w:t>
+      </w:r>
+    </w:p>
+    <w:bookmarkStart w:id="92" w:name="quick-start-4"/>
+    <w:p>
+      <w:pPr>
+        <w:pStyle w:val="Heading3"/>
+      </w:pPr>
+      <w:r>
+        <w:t xml:space="preserve">Quick start</w:t>
+      </w:r>
+    </w:p>
+    <w:p>
+      <w:pPr>
+        <w:pStyle w:val="FirstParagraph"/>
+      </w:pPr>
+      <w:r>
+        <w:t xml:space="preserve">Escanear sólo un objetivo de laboratorio aprobado, validar un hallazgo, corregirlo, cambiar y documentar el alcance y las limitaciones.</w:t>
+      </w:r>
+    </w:p>
+    <w:bookmarkEnd w:id="92"/>
+    <w:bookmarkEnd w:id="93"/>
+    <w:bookmarkStart w:id="94" w:name="evidencia-y-limitación-4"/>
+    <w:p>
+      <w:pPr>
+        <w:pStyle w:val="Heading2"/>
+      </w:pPr>
+      <w:r>
+        <w:t xml:space="preserve">Evidencia y limitación</w:t>
+      </w:r>
+    </w:p>
+    <w:p>
+      <w:pPr>
+        <w:pStyle w:val="FirstParagraph"/>
+      </w:pPr>
+      <w:r>
+        <w:t xml:space="preserve">Retener autorización, alcance, población objetivo, versión de herramientas y contenidos, configuración, resultado bruto, revisor, decisión, acción correctiva, excepción y retest. La herramienta admite trabajo seleccionado; no puede certificar la alineación CSF, determinar el alcance completo o reemplazar el juicio humano calificado.</w:t>
+      </w:r>
+    </w:p>
+    <w:bookmarkEnd w:id="94"/>
+    <w:bookmarkStart w:id="96" w:name="trivy"/>
+    <w:p>
+      <w:pPr>
+        <w:pStyle w:val="Heading2"/>
+      </w:pPr>
+      <w:r>
+        <w:t xml:space="preserve">16.7 Trivy</w:t>
+      </w:r>
+    </w:p>
+    <w:p>
+      <w:pPr>
+        <w:pStyle w:val="FirstParagraph"/>
+      </w:pPr>
+      <w:r>
+        <w:t xml:space="preserve">Código, imagen, dependencia, secreto y análisis de configuración. Posible soporte CSF: ID.RA, PR.PS.</w:t>
+      </w:r>
+    </w:p>
+    <w:p>
+      <w:pPr>
+        <w:pStyle w:val="BodyText"/>
+      </w:pPr>
+      <w:r>
+        <w:rPr>
+          <w:bCs/>
+          <w:b/>
+        </w:rPr>
+        <w:t xml:space="preserve">Documentación oficial:</w:t>
+      </w:r>
+      <w:r>
+        <w:t xml:space="preserve"> </w:t>
+      </w:r>
+      <w:r>
+        <w:t xml:space="preserve">Abra la guía oficial Trivy realizada/u título](https://trivy.dev/latest/)</w:t>
+      </w:r>
+    </w:p>
+    <w:bookmarkStart w:id="95" w:name="quick-start-5"/>
+    <w:p>
+      <w:pPr>
+        <w:pStyle w:val="Heading3"/>
+      </w:pPr>
+      <w:r>
+        <w:t xml:space="preserve">Quick start</w:t>
+      </w:r>
+    </w:p>
+    <w:p>
+      <w:pPr>
+        <w:pStyle w:val="FirstParagraph"/>
+      </w:pPr>
+      <w:r>
+        <w:t xml:space="preserve">Escríbete una imagen de laboratorio o un repositorio de pruebas, protege el informe, valida un resultado, corrigelo y vuelve a escanear.</w:t>
+      </w:r>
+    </w:p>
+    <w:bookmarkEnd w:id="95"/>
+    <w:bookmarkEnd w:id="96"/>
+    <w:bookmarkStart w:id="97" w:name="evidencia-y-limitación-5"/>
+    <w:p>
+      <w:pPr>
+        <w:pStyle w:val="Heading2"/>
+      </w:pPr>
+      <w:r>
+        <w:t xml:space="preserve">Evidencia y limitación</w:t>
+      </w:r>
+    </w:p>
+    <w:p>
+      <w:pPr>
+        <w:pStyle w:val="FirstParagraph"/>
+      </w:pPr>
+      <w:r>
+        <w:t xml:space="preserve">Retener autorización, alcance, población objetivo, versión de herramientas y contenidos, configuración, resultado bruto, revisor, decisión, acción correctiva, excepción y retest. La herramienta admite trabajo seleccionado; no puede certificar la alineación CSF, determinar el alcance completo o reemplazar el juicio humano calificado.</w:t>
+      </w:r>
+    </w:p>
+    <w:bookmarkEnd w:id="97"/>
+    <w:bookmarkStart w:id="99" w:name="owasp-zap"/>
+    <w:p>
+      <w:pPr>
+        <w:pStyle w:val="Heading2"/>
+      </w:pPr>
+      <w:r>
+        <w:t xml:space="preserve">16.8 OWASP ZAP</w:t>
+      </w:r>
+    </w:p>
+    <w:p>
+      <w:pPr>
+        <w:pStyle w:val="FirstParagraph"/>
+      </w:pPr>
+      <w:r>
+        <w:t xml:space="preserve">Evaluación autorizada de la aplicación web. Posible soporte CSF: ID.RA, ID.IM.</w:t>
+      </w:r>
+    </w:p>
+    <w:p>
+      <w:pPr>
+        <w:pStyle w:val="BodyText"/>
+      </w:pPr>
+      <w:r>
+        <w:rPr>
+          <w:bCs/>
+          <w:b/>
+        </w:rPr>
+        <w:t xml:space="preserve">Documentación oficial:</w:t>
+      </w:r>
+      <w:r>
+        <w:t xml:space="preserve"> </w:t>
+      </w:r>
+      <w:r>
+        <w:t xml:space="preserve">Abra la guía oficial OWASP ZAP efectuada / u fiel](https://www.zaproxy.org/getting-started/)</w:t>
+      </w:r>
+    </w:p>
+    <w:bookmarkStart w:id="98" w:name="quick-start-6"/>
+    <w:p>
+      <w:pPr>
+        <w:pStyle w:val="Heading3"/>
+      </w:pPr>
+      <w:r>
+        <w:t xml:space="preserve">Quick start</w:t>
+      </w:r>
+    </w:p>
+    <w:p>
+      <w:pPr>
+        <w:pStyle w:val="FirstParagraph"/>
+      </w:pPr>
+      <w:r>
+        <w:t xml:space="preserve">Proxy una aplicación de entrenamiento local, empezar con análisis pasivos, validar un hallazgo, y conservar el alcance y los resultados aprobados.</w:t>
+      </w:r>
+    </w:p>
+    <w:bookmarkEnd w:id="98"/>
+    <w:bookmarkEnd w:id="99"/>
+    <w:bookmarkStart w:id="100" w:name="evidencia-y-limitación-6"/>
+    <w:p>
+      <w:pPr>
+        <w:pStyle w:val="Heading2"/>
+      </w:pPr>
+      <w:r>
+        <w:t xml:space="preserve">Evidencia y limitación</w:t>
+      </w:r>
+    </w:p>
+    <w:p>
+      <w:pPr>
+        <w:pStyle w:val="FirstParagraph"/>
+      </w:pPr>
+      <w:r>
+        <w:t xml:space="preserve">Retener autorización, alcance, población objetivo, versión de herramientas y contenidos, configuración, resultado bruto, revisor, decisión, acción correctiva, excepción y retest. La herramienta admite trabajo seleccionado; no puede certificar la alineación CSF, determinar el alcance completo o reemplazar el juicio humano calificado.</w:t>
+      </w:r>
+    </w:p>
+    <w:bookmarkEnd w:id="100"/>
+    <w:bookmarkStart w:id="102" w:name="keycloak"/>
+    <w:p>
+      <w:pPr>
+        <w:pStyle w:val="Heading2"/>
+      </w:pPr>
+      <w:r>
+        <w:t xml:space="preserve">16.9 Keycloak</w:t>
+      </w:r>
+    </w:p>
+    <w:p>
+      <w:pPr>
+        <w:pStyle w:val="FirstParagraph"/>
+      </w:pPr>
+      <w:r>
+        <w:t xml:space="preserve">Identidad, roles, autenticación y MFA. Posible apoyo CSF: PR.AA.</w:t>
+      </w:r>
+    </w:p>
+    <w:p>
+      <w:pPr>
+        <w:pStyle w:val="BodyText"/>
+      </w:pPr>
+      <w:r>
+        <w:rPr>
+          <w:bCs/>
+          <w:b/>
+        </w:rPr>
+        <w:t xml:space="preserve">Documentación oficial:</w:t>
+      </w:r>
+      <w:r>
+        <w:t xml:space="preserve"> </w:t>
+      </w:r>
+      <w:r>
+        <w:t xml:space="preserve">[ obedeció]Abre la guía oficial de Keycloak realizada/u contacto](https://www.keycloak.org/guides)</w:t>
+      </w:r>
+    </w:p>
+    <w:bookmarkStart w:id="101" w:name="quick-start-7"/>
+    <w:p>
+      <w:pPr>
+        <w:pStyle w:val="Heading3"/>
+      </w:pPr>
+      <w:r>
+        <w:t xml:space="preserve">Quick start</w:t>
+      </w:r>
+    </w:p>
+    <w:p>
+      <w:pPr>
+        <w:pStyle w:val="FirstParagraph"/>
+      </w:pPr>
+      <w:r>
+        <w:t xml:space="preserve">Crear un reino de laboratorio, usuarios, roles y MFA; probar menos privilegios, acceso fallido y eliminación; exportar evidencia de configuración sanitaria.</w:t>
+      </w:r>
+    </w:p>
+    <w:bookmarkEnd w:id="101"/>
+    <w:bookmarkEnd w:id="102"/>
+    <w:bookmarkStart w:id="103" w:name="evidencia-y-limitación-7"/>
+    <w:p>
+      <w:pPr>
+        <w:pStyle w:val="Heading2"/>
+      </w:pPr>
+      <w:r>
+        <w:t xml:space="preserve">Evidencia y limitación</w:t>
+      </w:r>
+    </w:p>
+    <w:p>
+      <w:pPr>
+        <w:pStyle w:val="FirstParagraph"/>
+      </w:pPr>
+      <w:r>
+        <w:t xml:space="preserve">Retener autorización, alcance, población objetivo, versión de herramientas y contenidos, configuración, resultado bruto, revisor, decisión, acción correctiva, excepción y retest. La herramienta admite trabajo seleccionado; no puede certificar la alineación CSF, determinar el alcance completo o reemplazar el juicio humano calificado.</w:t>
+      </w:r>
+    </w:p>
+    <w:bookmarkEnd w:id="103"/>
+    <w:bookmarkStart w:id="105" w:name="defectodojo"/>
+    <w:p>
+      <w:pPr>
+        <w:pStyle w:val="Heading2"/>
+      </w:pPr>
+      <w:r>
+        <w:t xml:space="preserve">16.10 DefectoDojo</w:t>
+      </w:r>
+    </w:p>
+    <w:p>
+      <w:pPr>
+        <w:pStyle w:val="FirstParagraph"/>
+      </w:pPr>
+      <w:r>
+        <w:t xml:space="preserve">Encontrar captación y seguimiento de remediación. Posible apoyo CSF: ID.RA, ID.IM, GV.OV.</w:t>
+      </w:r>
+    </w:p>
+    <w:p>
+      <w:pPr>
+        <w:pStyle w:val="BodyText"/>
+      </w:pPr>
+      <w:r>
+        <w:rPr>
+          <w:bCs/>
+          <w:b/>
+        </w:rPr>
+        <w:t xml:space="preserve">Documentación oficial:</w:t>
+      </w:r>
+      <w:r>
+        <w:t xml:space="preserve"> </w:t>
+      </w:r>
+      <w:r>
+        <w:t xml:space="preserve">[Seguido]Abre el defecto oficialDojo guía seleccionada/u contacto](https://docs.defectdojo.com/)</w:t>
+      </w:r>
+    </w:p>
+    <w:bookmarkStart w:id="104" w:name="quick-start-8"/>
+    <w:p>
+      <w:pPr>
+        <w:pStyle w:val="Heading3"/>
+      </w:pPr>
+      <w:r>
+        <w:t xml:space="preserve">Quick start</w:t>
+      </w:r>
+    </w:p>
+    <w:p>
+      <w:pPr>
+        <w:pStyle w:val="FirstParagraph"/>
+      </w:pPr>
+      <w:r>
+        <w:t xml:space="preserve">Importar un informe de laboratorio, validar y asignar un hallazgo, registrar corrección, retestarlo y cerrarlo con prueba.</w:t>
+      </w:r>
+    </w:p>
+    <w:bookmarkEnd w:id="104"/>
+    <w:bookmarkEnd w:id="105"/>
+    <w:bookmarkStart w:id="107" w:name="evidencia-y-limitación-8"/>
+    <w:p>
+      <w:pPr>
+        <w:pStyle w:val="Heading2"/>
+      </w:pPr>
+      <w:r>
+        <w:t xml:space="preserve">Evidencia y limitación</w:t>
+      </w:r>
+    </w:p>
+    <w:p>
+      <w:pPr>
+        <w:pStyle w:val="FirstParagraph"/>
+      </w:pPr>
+      <w:r>
+        <w:t xml:space="preserve">Retener autorización, alcance, población objetivo, versión de herramientas y contenidos, configuración, resultado bruto, revisor, decisión, acción correctiva, excepción y retest. La herramienta admite trabajo seleccionado; no puede certificar la alineación CSF, determinar el alcance completo o reemplazar el juicio humano calificado.</w:t>
+      </w:r>
+    </w:p>
     <w:p>
       <w:pPr>
         <w:pStyle w:val="BodyText"/>
@@ -7890,7 +7915,7 @@
         <w:t xml:space="preserve">[Seguridad]Abre la guía oficial Velociraptor realizada/u contacto](https://docs.velociraptor.app/)</w:t>
       </w:r>
     </w:p>
-    <w:bookmarkStart w:id="91" w:name="quick-start-9"/>
+    <w:bookmarkStart w:id="106" w:name="quick-start-9"/>
     <w:p>
       <w:pPr>
         <w:pStyle w:val="Heading3"/>
@@ -7907,9 +7932,9 @@
         <w:t xml:space="preserve">Utilice un cliente de laboratorio aislado, recoger un artefacto aprobado inofensivo, y propósito de registro, alcance, colección, revisión y preservación.</w:t>
       </w:r>
     </w:p>
-    <w:bookmarkEnd w:id="91"/>
-    <w:bookmarkEnd w:id="92"/>
-    <w:bookmarkStart w:id="93" w:name="evidencia-y-limitación-9"/>
+    <w:bookmarkEnd w:id="106"/>
+    <w:bookmarkEnd w:id="107"/>
+    <w:bookmarkStart w:id="108" w:name="evidencia-y-limitación-9"/>
     <w:p>
       <w:pPr>
         <w:pStyle w:val="Heading2"/>
@@ -7926,8 +7951,8 @@
         <w:t xml:space="preserve">Retener autorización, alcance, población objetivo, versión de herramientas y contenidos, configuración, resultado bruto, revisor, decisión, acción correctiva, excepción y retest. La herramienta admite trabajo seleccionado; no puede certificar la alineación CSF, determinar el alcance completo o reemplazar el juicio humano calificado.</w:t>
       </w:r>
     </w:p>
-    <w:bookmarkEnd w:id="93"/>
-    <w:bookmarkStart w:id="95" w:name="open-policy-agent"/>
+    <w:bookmarkEnd w:id="108"/>
+    <w:bookmarkStart w:id="110" w:name="open-policy-agent"/>
     <w:p>
       <w:pPr>
         <w:pStyle w:val="Heading2"/>
@@ -7962,7 +7987,7 @@
         <w:t xml:space="preserve">[Seguridad]Abre la guía oficial de Agentes de Políticas Abiertas efectuada/u contacto](https://www.openpolicyagent.org/docs)</w:t>
       </w:r>
     </w:p>
-    <w:bookmarkStart w:id="94" w:name="quick-start-10"/>
+    <w:bookmarkStart w:id="109" w:name="quick-start-10"/>
     <w:p>
       <w:pPr>
         <w:pStyle w:val="Heading3"/>
@@ -7979,9 +8004,9 @@
         <w:t xml:space="preserve">Escribir una regla de laboratorio que requiera un propietario, clasificación y entorno aprobado; probar los insumos permitidos y negados.</w:t>
       </w:r>
     </w:p>
-    <w:bookmarkEnd w:id="94"/>
-    <w:bookmarkEnd w:id="95"/>
-    <w:bookmarkStart w:id="96" w:name="evidencia-y-limitación-10"/>
+    <w:bookmarkEnd w:id="109"/>
+    <w:bookmarkEnd w:id="110"/>
+    <w:bookmarkStart w:id="111" w:name="evidencia-y-limitación-10"/>
     <w:p>
       <w:pPr>
         <w:pStyle w:val="Heading2"/>
@@ -7998,8 +8023,8 @@
         <w:t xml:space="preserve">Retener autorización, alcance, población objetivo, versión de herramientas y contenidos, configuración, resultado bruto, revisor, decisión, acción correctiva, excepción y retest. La herramienta admite trabajo seleccionado; no puede certificar la alineación CSF, determinar el alcance completo o reemplazar el juicio humano calificado.</w:t>
       </w:r>
     </w:p>
-    <w:bookmarkEnd w:id="96"/>
-    <w:bookmarkStart w:id="98" w:name="opensearch"/>
+    <w:bookmarkEnd w:id="111"/>
+    <w:bookmarkStart w:id="113" w:name="opensearch"/>
     <w:p>
       <w:pPr>
         <w:pStyle w:val="Heading2"/>
@@ -8034,7 +8059,7 @@
         <w:t xml:space="preserve">[Seguridad]Abre la guía oficial OpenSearch efectuada/u contacto](https://opensearch.org/docs/latest/getting-started/)</w:t>
       </w:r>
     </w:p>
-    <w:bookmarkStart w:id="97" w:name="quick-start-11"/>
+    <w:bookmarkStart w:id="112" w:name="quick-start-11"/>
     <w:p>
       <w:pPr>
         <w:pStyle w:val="Heading3"/>
@@ -8051,9 +8076,9 @@
         <w:t xml:space="preserve">Cargar eventos de seguridad sintéticos, construir una búsqueda y panel de control, documentar la cobertura de datos, acceso, retención, revisión y limitaciones.</w:t>
       </w:r>
     </w:p>
-    <w:bookmarkEnd w:id="97"/>
-    <w:bookmarkEnd w:id="98"/>
-    <w:bookmarkStart w:id="99" w:name="evidencia-y-limitación-11"/>
+    <w:bookmarkEnd w:id="112"/>
+    <w:bookmarkEnd w:id="113"/>
+    <w:bookmarkStart w:id="114" w:name="evidencia-y-limitación-11"/>
     <w:p>
       <w:pPr>
         <w:pStyle w:val="Heading2"/>
@@ -8070,8 +8095,8 @@
         <w:t xml:space="preserve">Retener autorización, alcance, población objetivo, versión de herramientas y contenidos, configuración, resultado bruto, revisor, decisión, acción correctiva, excepción y retest. La herramienta admite trabajo seleccionado; no puede certificar la alineación CSF, determinar el alcance completo o reemplazar el juicio humano calificado.</w:t>
       </w:r>
     </w:p>
-    <w:bookmarkEnd w:id="99"/>
-    <w:bookmarkStart w:id="100" w:name="official-nist-tools"/>
+    <w:bookmarkEnd w:id="114"/>
+    <w:bookmarkStart w:id="115" w:name="official-nist-tools"/>
     <w:p>
       <w:pPr>
         <w:pStyle w:val="Heading2"/>
@@ -8106,9 +8131,9 @@
         <w:t xml:space="preserve">** Perfiles organizacionales:** [ ] Guía de perfil y plantillas seleccionadas/u fiel](https://www.nist.gov/cyberframework/profiles)</w:t>
       </w:r>
     </w:p>
-    <w:bookmarkEnd w:id="100"/>
-    <w:bookmarkEnd w:id="101"/>
-    <w:bookmarkStart w:id="105" w:name="libro-de-juegos-csf-del-administrador"/>
+    <w:bookmarkEnd w:id="115"/>
+    <w:bookmarkEnd w:id="116"/>
+    <w:bookmarkStart w:id="120" w:name="libro-de-juegos-csf-del-administrador"/>
     <w:p>
       <w:pPr>
         <w:pStyle w:val="Heading1"/>
@@ -8129,7 +8154,7 @@
         <w:t xml:space="preserve">Las preguntas, las rutinas de gobernanza, los tableros de control y los administradores de decisiones deben controlar.</w:t>
       </w:r>
     </w:p>
-    <w:bookmarkStart w:id="102" w:name="preguntas-mensuales"/>
+    <w:bookmarkStart w:id="117" w:name="preguntas-mensuales"/>
     <w:p>
       <w:pPr>
         <w:pStyle w:val="Heading2"/>
@@ -8226,8 +8251,8 @@
         <w:t xml:space="preserve">¿Qué limitaciones debe entender el liderazgo antes de confiar en el tablero?</w:t>
       </w:r>
     </w:p>
-    <w:bookmarkEnd w:id="102"/>
-    <w:bookmarkStart w:id="103" w:name="dashboard"/>
+    <w:bookmarkEnd w:id="117"/>
+    <w:bookmarkStart w:id="118" w:name="dashboard"/>
     <w:p>
       <w:pPr>
         <w:pStyle w:val="Heading2"/>
@@ -8314,8 +8339,8 @@
         <w:t xml:space="preserve">Ø Mejoramiento Silencio ¿Se han corregido los resultados y se han vuelto a comprobar de forma independiente? Verde / Amarillo / Rojo</w:t>
       </w:r>
     </w:p>
-    <w:bookmarkEnd w:id="103"/>
-    <w:bookmarkStart w:id="104" w:name="errores-comunes"/>
+    <w:bookmarkEnd w:id="118"/>
+    <w:bookmarkStart w:id="119" w:name="errores-comunes"/>
     <w:p>
       <w:pPr>
         <w:pStyle w:val="Heading2"/>
@@ -8423,9 +8448,9 @@
         <w:t xml:space="preserve">Describir la alineación CSF como cumplimiento legal o certificación NIST.</w:t>
       </w:r>
     </w:p>
-    <w:bookmarkEnd w:id="104"/>
-    <w:bookmarkEnd w:id="105"/>
-    <w:bookmarkStart w:id="126" w:name="from-beginner-to-junior-analyst"/>
+    <w:bookmarkEnd w:id="119"/>
+    <w:bookmarkEnd w:id="120"/>
+    <w:bookmarkStart w:id="144" w:name="from-beginner-to-junior-analyst"/>
     <w:p>
       <w:pPr>
         <w:pStyle w:val="Heading1"/>
@@ -8448,56 +8473,58 @@
     </w:p>
     <w:p>
       <w:pPr>
-        <w:pStyle w:val="BodyText"/>
-      </w:pPr>
-      <w:r>
-        <w:t xml:space="preserve">■img src=</w:t>
-      </w:r>
-      <w:r>
-        <w:t xml:space="preserve">“</w:t>
-      </w:r>
-      <w:r>
-        <w:t xml:space="preserve">media/image8.png</w:t>
-      </w:r>
-      <w:r>
-        <w:t xml:space="preserve">”</w:t>
-      </w:r>
-      <w:r>
-        <w:t xml:space="preserve"> </w:t>
-      </w:r>
-      <w:r>
-        <w:t xml:space="preserve">estilo=</w:t>
-      </w:r>
-      <w:r>
-        <w:t xml:space="preserve">“</w:t>
-      </w:r>
-      <w:r>
-        <w:t xml:space="preserve">Ancho:6.15in; Altura:3.20335in</w:t>
-      </w:r>
-      <w:r>
-        <w:t xml:space="preserve">”</w:t>
-      </w:r>
-      <w:r>
-        <w:t xml:space="preserve"> </w:t>
-      </w:r>
-      <w:r>
-        <w:t xml:space="preserve">alt=</w:t>
-      </w:r>
-      <w:r>
-        <w:t xml:space="preserve">“</w:t>
-      </w:r>
+        <w:pStyle w:val="CaptionedFigure"/>
+      </w:pPr>
+      <w:r>
+        <w:drawing>
+          <wp:inline>
+            <wp:extent cx="5334000" cy="2963333"/>
+            <wp:effectExtent b="0" l="0" r="0" t="0"/>
+            <wp:docPr descr="Aprender, mapa, test, reportar y aplicar con evidencia de cartera honesta." title="" id="122" name="Picture"/>
+            <a:graphic>
+              <a:graphicData uri="http://schemas.openxmlformats.org/drawingml/2006/picture">
+                <pic:pic>
+                  <pic:nvPicPr>
+                    <pic:cNvPr descr="media/image6_es-419.png" id="123" name="Picture"/>
+                    <pic:cNvPicPr>
+                      <a:picLocks noChangeArrowheads="1" noChangeAspect="1"/>
+                    </pic:cNvPicPr>
+                  </pic:nvPicPr>
+                  <pic:blipFill>
+                    <a:blip r:embed="rId121"/>
+                    <a:stretch>
+                      <a:fillRect/>
+                    </a:stretch>
+                  </pic:blipFill>
+                  <pic:spPr bwMode="auto">
+                    <a:xfrm>
+                      <a:off x="0" y="0"/>
+                      <a:ext cx="5334000" cy="2963333"/>
+                    </a:xfrm>
+                    <a:prstGeom prst="rect">
+                      <a:avLst/>
+                    </a:prstGeom>
+                    <a:noFill/>
+                    <a:ln w="9525">
+                      <a:noFill/>
+                      <a:headEnd/>
+                      <a:tailEnd/>
+                    </a:ln>
+                  </pic:spPr>
+                </pic:pic>
+              </a:graphicData>
+            </a:graphic>
+          </wp:inline>
+        </w:drawing>
+      </w:r>
+    </w:p>
+    <w:p>
+      <w:pPr>
+        <w:pStyle w:val="ImageCaption"/>
+      </w:pPr>
       <w:r>
         <w:t xml:space="preserve">Aprender, mapa, test, reportar y aplicar con evidencia de cartera honesta.</w:t>
       </w:r>
-      <w:r>
-        <w:t xml:space="preserve">”</w:t>
-      </w:r>
-      <w:r>
-        <w:t xml:space="preserve"> </w:t>
-      </w:r>
-      <w:r>
-        <w:t xml:space="preserve">/</w:t>
-      </w:r>
     </w:p>
     <w:p>
       <w:pPr>
@@ -8507,7 +8534,7 @@
         <w:t xml:space="preserve">Figura 8. Vía de analista junior</w:t>
       </w:r>
     </w:p>
-    <w:bookmarkStart w:id="106" w:name="funciones-de-nivel-de-entrada"/>
+    <w:bookmarkStart w:id="124" w:name="funciones-de-nivel-de-entrada"/>
     <w:p>
       <w:pPr>
         <w:pStyle w:val="Heading2"/>
@@ -8588,8 +8615,8 @@
         <w:t xml:space="preserve">Analista de Auditoría</w:t>
       </w:r>
     </w:p>
-    <w:bookmarkEnd w:id="106"/>
-    <w:bookmarkStart w:id="107" w:name="trabajar-un-analista-junior-puede-actuar"/>
+    <w:bookmarkEnd w:id="124"/>
+    <w:bookmarkStart w:id="125" w:name="trabajar-un-analista-junior-puede-actuar"/>
     <w:p>
       <w:pPr>
         <w:pStyle w:val="Heading2"/>
@@ -8686,8 +8713,8 @@
         <w:t xml:space="preserve">Proteger información confidencial y seguir límites de autorización.</w:t>
       </w:r>
     </w:p>
-    <w:bookmarkEnd w:id="107"/>
-    <w:bookmarkStart w:id="108" w:name="portafolio-proof"/>
+    <w:bookmarkEnd w:id="125"/>
+    <w:bookmarkStart w:id="126" w:name="portafolio-proof"/>
     <w:p>
       <w:pPr>
         <w:pStyle w:val="Heading2"/>
@@ -8809,8 +8836,8 @@
         <w:t xml:space="preserve">Harbor Light Services es una organización ficticia que proporciona un portal de clientes, centro de llamadas, colaboración en la nube, integración de pagos, fuerza de trabajo remota y análisis anfitriones por proveedores. Cada persona, cuenta, dirección, activo, evento, registro de clientes y proveedor es inventado.</w:t>
       </w:r>
     </w:p>
-    <w:bookmarkEnd w:id="108"/>
-    <w:bookmarkStart w:id="109" w:name="project-1-scope-and-context"/>
+    <w:bookmarkEnd w:id="126"/>
+    <w:bookmarkStart w:id="127" w:name="project-1-scope-and-context"/>
     <w:p>
       <w:pPr>
         <w:pStyle w:val="Heading2"/>
@@ -8827,8 +8854,8 @@
         <w:t xml:space="preserve">Definir misión, partes interesadas, obligaciones, servicios críticos, dependencias, exclusiones y propietarios.</w:t>
       </w:r>
     </w:p>
-    <w:bookmarkEnd w:id="109"/>
-    <w:bookmarkStart w:id="110" w:name="project-2-asset-and-data-map"/>
+    <w:bookmarkEnd w:id="127"/>
+    <w:bookmarkStart w:id="128" w:name="project-2-asset-and-data-map"/>
     <w:p>
       <w:pPr>
         <w:pStyle w:val="Heading2"/>
@@ -8861,8 +8888,8 @@
         <w:t xml:space="preserve">Cree una amenaza, vulnerabilidad, probabilidad, impacto, tratamiento y registro de riesgo residual.</w:t>
       </w:r>
     </w:p>
-    <w:bookmarkEnd w:id="110"/>
-    <w:bookmarkStart w:id="111" w:name="project-4-profiles"/>
+    <w:bookmarkEnd w:id="128"/>
+    <w:bookmarkStart w:id="129" w:name="project-4-profiles"/>
     <w:p>
       <w:pPr>
         <w:pStyle w:val="Heading2"/>
@@ -8879,8 +8906,8 @@
         <w:t xml:space="preserve">Cree perfiles de objetivos actuales y basados en riesgos.</w:t>
       </w:r>
     </w:p>
-    <w:bookmarkEnd w:id="111"/>
-    <w:bookmarkStart w:id="112" w:name="project-5-controles-y-pruebas"/>
+    <w:bookmarkEnd w:id="129"/>
+    <w:bookmarkStart w:id="130" w:name="project-5-controles-y-pruebas"/>
     <w:p>
       <w:pPr>
         <w:pStyle w:val="Heading2"/>
@@ -8897,8 +8924,8 @@
         <w:t xml:space="preserve">Diseñar y ejecutar pruebas ficticias para el acceso, vulnerabilidades, registros, respaldos y proveedores.</w:t>
       </w:r>
     </w:p>
-    <w:bookmarkEnd w:id="112"/>
-    <w:bookmarkStart w:id="113" w:name="project-6-incident"/>
+    <w:bookmarkEnd w:id="130"/>
+    <w:bookmarkStart w:id="131" w:name="project-6-incident"/>
     <w:p>
       <w:pPr>
         <w:pStyle w:val="Heading2"/>
@@ -8915,8 +8942,8 @@
         <w:t xml:space="preserve">Analizar eventos sintéticos, declarar un incidente, preservar evidencia, contener, erradicar, restaurar y aprender.</w:t>
       </w:r>
     </w:p>
-    <w:bookmarkEnd w:id="113"/>
-    <w:bookmarkStart w:id="114" w:name="project-7-tools"/>
+    <w:bookmarkEnd w:id="131"/>
+    <w:bookmarkStart w:id="132" w:name="project-7-tools"/>
     <w:p>
       <w:pPr>
         <w:pStyle w:val="Heading2"/>
@@ -9044,8 +9071,8 @@
         <w:t xml:space="preserve">Silencio Semana 4 Silencio Herramientas, reportajes, portafolio y entrevistas ← Portafolio Sanitizado, dashboard, respuestas practicadas</w:t>
       </w:r>
     </w:p>
-    <w:bookmarkEnd w:id="114"/>
-    <w:bookmarkStart w:id="115" w:name="hábitos-diarios"/>
+    <w:bookmarkEnd w:id="132"/>
+    <w:bookmarkStart w:id="133" w:name="hábitos-diarios"/>
     <w:p>
       <w:pPr>
         <w:pStyle w:val="Heading2"/>
@@ -9121,8 +9148,8 @@
         <w:t xml:space="preserve">.</w:t>
       </w:r>
     </w:p>
-    <w:bookmarkEnd w:id="115"/>
-    <w:bookmarkStart w:id="116" w:name="qué-es-nist-csf-2.0"/>
+    <w:bookmarkEnd w:id="133"/>
+    <w:bookmarkStart w:id="134" w:name="qué-es-nist-csf-2.0"/>
     <w:p>
       <w:pPr>
         <w:pStyle w:val="Heading2"/>
@@ -9139,8 +9166,8 @@
         <w:t xml:space="preserve">Un marco flexible centrado en los resultados que ayuda a las organizaciones a comprender, evaluar, priorizar y comunicar el riesgo de ciberseguridad utilizando el núcleo, los perfiles, los niveles y los recursos de apoyo.</w:t>
       </w:r>
     </w:p>
-    <w:bookmarkEnd w:id="116"/>
-    <w:bookmarkStart w:id="117" w:name="cuáles-son-las-seis-funciones"/>
+    <w:bookmarkEnd w:id="134"/>
+    <w:bookmarkStart w:id="135" w:name="cuáles-son-las-seis-funciones"/>
     <w:p>
       <w:pPr>
         <w:pStyle w:val="Heading2"/>
@@ -9157,8 +9184,8 @@
         <w:t xml:space="preserve">Govern, Identificar, Proteger, Detectar, Responder y Recover.</w:t>
       </w:r>
     </w:p>
-    <w:bookmarkEnd w:id="117"/>
-    <w:bookmarkStart w:id="118" w:name="por-qué-fue-agregado-govern"/>
+    <w:bookmarkEnd w:id="135"/>
+    <w:bookmarkStart w:id="136" w:name="por-qué-fue-agregado-govern"/>
     <w:p>
       <w:pPr>
         <w:pStyle w:val="Heading2"/>
@@ -9175,8 +9202,8 @@
         <w:t xml:space="preserve">Hace explícita la rendición de cuentas, la política, la estrategia de riesgo, la integración de los riesgos institucionales, la supervisión y el riesgo de cadena de suministro.</w:t>
       </w:r>
     </w:p>
-    <w:bookmarkEnd w:id="118"/>
-    <w:bookmarkStart w:id="119" w:name="qué-es-un-perfil-actual"/>
+    <w:bookmarkEnd w:id="136"/>
+    <w:bookmarkStart w:id="137" w:name="qué-es-un-perfil-actual"/>
     <w:p>
       <w:pPr>
         <w:pStyle w:val="Heading2"/>
@@ -9193,8 +9220,8 @@
         <w:t xml:space="preserve">A description of Core outcomes a defined scope is currently achieving or attempting to achieve, including how or to what extent.</w:t>
       </w:r>
     </w:p>
-    <w:bookmarkEnd w:id="119"/>
-    <w:bookmarkStart w:id="120" w:name="qué-es-un-perfil-objetivo"/>
+    <w:bookmarkEnd w:id="137"/>
+    <w:bookmarkStart w:id="138" w:name="qué-es-un-perfil-objetivo"/>
     <w:p>
       <w:pPr>
         <w:pStyle w:val="Heading2"/>
@@ -9211,8 +9238,8 @@
         <w:t xml:space="preserve">Los resultados básicos prioritarios que la organización selecciona para un estado futuro definido basado en la misión, el riesgo, las obligaciones, los interesados y los recursos.</w:t>
       </w:r>
     </w:p>
-    <w:bookmarkEnd w:id="120"/>
-    <w:bookmarkStart w:id="121" w:name="qué-son-los-tiers"/>
+    <w:bookmarkEnd w:id="138"/>
+    <w:bookmarkStart w:id="139" w:name="qué-son-los-tiers"/>
     <w:p>
       <w:pPr>
         <w:pStyle w:val="Heading2"/>
@@ -9229,8 +9256,8 @@
         <w:t xml:space="preserve">Context for the rigor of cibersecurity risk governance and management practices: Partial, Risk Informed, Repible, and Adaptive.</w:t>
       </w:r>
     </w:p>
-    <w:bookmarkEnd w:id="121"/>
-    <w:bookmarkStart w:id="122" w:name="csf-certifica-el-cumplimiento"/>
+    <w:bookmarkEnd w:id="139"/>
+    <w:bookmarkStart w:id="140" w:name="csf-certifica-el-cumplimiento"/>
     <w:p>
       <w:pPr>
         <w:pStyle w:val="Heading2"/>
@@ -9247,8 +9274,8 @@
         <w:t xml:space="preserve">No. La alineación CSF no crea el cumplimiento legal ni la certificación NIST. Las obligaciones aplicables y los controles aplicados deben evaluarse por separado.</w:t>
       </w:r>
     </w:p>
-    <w:bookmarkEnd w:id="122"/>
-    <w:bookmarkStart w:id="123" w:name="cómo-verificas-un-resultado"/>
+    <w:bookmarkEnd w:id="140"/>
+    <w:bookmarkStart w:id="141" w:name="cómo-verificas-un-resultado"/>
     <w:p>
       <w:pPr>
         <w:pStyle w:val="Heading2"/>
@@ -9265,8 +9292,8 @@
         <w:t xml:space="preserve">Definir el alcance y los criterios, evaluar el diseño de control, obtener una población completa, muestra por riesgo, inspeccionar y repercutir, registrar excepciones, corregir, retest y declarar una conclusión apoyada.</w:t>
       </w:r>
     </w:p>
-    <w:bookmarkEnd w:id="123"/>
-    <w:bookmarkStart w:id="124" w:name="cómo-deben-usarse-las-herramientas"/>
+    <w:bookmarkEnd w:id="141"/>
+    <w:bookmarkStart w:id="142" w:name="cómo-deben-usarse-las-herramientas"/>
     <w:p>
       <w:pPr>
         <w:pStyle w:val="Heading2"/>
@@ -9283,8 +9310,8 @@
         <w:t xml:space="preserve">Sólo con autorización y como una fuente de evidencia. Validar la cobertura y los resultados, proteger los productos, corregir las brechas confirmadas y volver a probar.</w:t>
       </w:r>
     </w:p>
-    <w:bookmarkEnd w:id="124"/>
-    <w:bookmarkStart w:id="125" w:name="cómo-priorizas-las-brechas"/>
+    <w:bookmarkEnd w:id="142"/>
+    <w:bookmarkStart w:id="143" w:name="cómo-priorizas-las-brechas"/>
     <w:p>
       <w:pPr>
         <w:pStyle w:val="Heading2"/>
@@ -9331,9 +9358,9 @@
         <w:t xml:space="preserve">Respuesta</w:t>
       </w:r>
     </w:p>
-    <w:bookmarkEnd w:id="125"/>
-    <w:bookmarkEnd w:id="126"/>
-    <w:bookmarkStart w:id="132" w:name="plantillas-y-listas-de-verificación"/>
+    <w:bookmarkEnd w:id="143"/>
+    <w:bookmarkEnd w:id="144"/>
+    <w:bookmarkStart w:id="150" w:name="plantillas-y-listas-de-verificación"/>
     <w:p>
       <w:pPr>
         <w:pStyle w:val="Heading1"/>
@@ -9354,7 +9381,7 @@
         <w:t xml:space="preserve">Estructuras útiles para un sistema de organización aprobado*.</w:t>
       </w:r>
     </w:p>
-    <w:bookmarkStart w:id="127" w:name="profile-record"/>
+    <w:bookmarkStart w:id="145" w:name="profile-record"/>
     <w:p>
       <w:pPr>
         <w:pStyle w:val="Heading2"/>
@@ -9451,8 +9478,8 @@
         <w:t xml:space="preserve">Historial de aprobación y versión</w:t>
       </w:r>
     </w:p>
-    <w:bookmarkEnd w:id="127"/>
-    <w:bookmarkStart w:id="128" w:name="risk-register"/>
+    <w:bookmarkEnd w:id="145"/>
+    <w:bookmarkStart w:id="146" w:name="risk-register"/>
     <w:p>
       <w:pPr>
         <w:pStyle w:val="Heading2"/>
@@ -9538,8 +9565,8 @@
         <w:t xml:space="preserve">Indicador, gatillo de revisión, expiración de excepción y retest</w:t>
       </w:r>
     </w:p>
-    <w:bookmarkEnd w:id="128"/>
-    <w:bookmarkStart w:id="129" w:name="ficha-de-control"/>
+    <w:bookmarkEnd w:id="146"/>
+    <w:bookmarkStart w:id="147" w:name="ficha-de-control"/>
     <w:p>
       <w:pPr>
         <w:pStyle w:val="Heading2"/>
@@ -9625,8 +9652,8 @@
         <w:t xml:space="preserve">Retest, conclusión, limitaciones, revisor y aprobación</w:t>
       </w:r>
     </w:p>
-    <w:bookmarkEnd w:id="129"/>
-    <w:bookmarkStart w:id="130" w:name="revisión-del-proveedor"/>
+    <w:bookmarkEnd w:id="147"/>
+    <w:bookmarkStart w:id="148" w:name="revisión-del-proveedor"/>
     <w:p>
       <w:pPr>
         <w:pStyle w:val="Heading2"/>
@@ -9679,8 +9706,8 @@
         <w:t xml:space="preserve">Vigilancia, hallazgos, excepciones, acciones correctivas, ejercicios, incidentes, cambios, renovación y terminación</w:t>
       </w:r>
     </w:p>
-    <w:bookmarkEnd w:id="130"/>
-    <w:bookmarkStart w:id="131" w:name="Xd154050ad2f858fb995bf5a81e185461cb3b560"/>
+    <w:bookmarkEnd w:id="148"/>
+    <w:bookmarkStart w:id="149" w:name="Xd154050ad2f858fb995bf5a81e185461cb3b560"/>
     <w:p>
       <w:pPr>
         <w:pStyle w:val="Heading2"/>
@@ -9788,9 +9815,9 @@
         <w:t xml:space="preserve">Excepciones, aceptaciones, limitaciones y pruebas visibles para los encargados de adoptar decisiones</w:t>
       </w:r>
     </w:p>
-    <w:bookmarkEnd w:id="131"/>
-    <w:bookmarkEnd w:id="132"/>
-    <w:bookmarkStart w:id="134" w:name="índice-de-glosario-y-asunto"/>
+    <w:bookmarkEnd w:id="149"/>
+    <w:bookmarkEnd w:id="150"/>
+    <w:bookmarkStart w:id="152" w:name="índice-de-glosario-y-asunto"/>
     <w:p>
       <w:pPr>
         <w:pStyle w:val="Heading1"/>
@@ -9974,7 +10001,7 @@
         <w:t xml:space="preserve">Más. Context for the rigor of cibersecurity risk governance and risk-management practices.</w:t>
       </w:r>
     </w:p>
-    <w:bookmarkStart w:id="133" w:name="subject-index"/>
+    <w:bookmarkStart w:id="151" w:name="subject-index"/>
     <w:p>
       <w:pPr>
         <w:pStyle w:val="Heading2"/>
@@ -10073,9 +10100,9 @@
         <w:t xml:space="preserve">Silencioso analista junior Silencio 18–21 Silencio Gestión de la Vulnerabilidad</w:t>
       </w:r>
     </w:p>
-    <w:bookmarkEnd w:id="133"/>
-    <w:bookmarkEnd w:id="134"/>
-    <w:bookmarkStart w:id="138" w:name="referencias-oficiales-y-estudio-ulterior"/>
+    <w:bookmarkEnd w:id="151"/>
+    <w:bookmarkEnd w:id="152"/>
+    <w:bookmarkStart w:id="156" w:name="referencias-oficiales-y-estudio-ulterior"/>
     <w:p>
       <w:pPr>
         <w:pStyle w:val="Heading1"/>
@@ -10132,7 +10159,7 @@
       <w:pPr>
         <w:pStyle w:val="BodyText"/>
       </w:pPr>
-      <w:hyperlink r:id="rId135">
+      <w:hyperlink r:id="rId153">
         <w:r>
           <w:rPr>
             <w:rStyle w:val="Hyperlink"/>
@@ -10167,7 +10194,7 @@
       <w:r>
         <w:t xml:space="preserve"> </w:t>
       </w:r>
-      <w:hyperlink r:id="rId136">
+      <w:hyperlink r:id="rId154">
         <w:r>
           <w:rPr>
             <w:rStyle w:val="Hyperlink"/>
@@ -10228,7 +10255,7 @@
       <w:pPr>
         <w:pStyle w:val="BodyText"/>
       </w:pPr>
-      <w:hyperlink r:id="rId137">
+      <w:hyperlink r:id="rId155">
         <w:r>
           <w:rPr>
             <w:rStyle w:val="Hyperlink"/>
@@ -10267,7 +10294,7 @@
         <w:t xml:space="preserve">Silencio.</w:t>
       </w:r>
     </w:p>
-    <w:bookmarkEnd w:id="138"/>
+    <w:bookmarkEnd w:id="156"/>
     <w:sectPr/>
   </w:body>
 </w:document>

</xml_diff>